<commit_message>
Adopt final RafiQi UI and reconnect live dashboard data
</commit_message>
<xml_diff>
--- a/User Guid.docx
+++ b/User Guid.docx
@@ -1,6 +1,6 @@
 
 <file path=word/document.xml><?xml version="1.0" encoding="utf-8"?>
-<w:document xmlns:wpc="http://schemas.microsoft.com/office/word/2010/wordprocessingCanvas" xmlns:cx="http://schemas.microsoft.com/office/drawing/2014/chartex" xmlns:cx1="http://schemas.microsoft.com/office/drawing/2015/9/8/chartex" xmlns:cx2="http://schemas.microsoft.com/office/drawing/2015/10/21/chartex" xmlns:cx3="http://schemas.microsoft.com/office/drawing/2016/5/9/chartex" xmlns:cx4="http://schemas.microsoft.com/office/drawing/2016/5/10/chartex" xmlns:cx5="http://schemas.microsoft.com/office/drawing/2016/5/11/chartex" xmlns:cx6="http://schemas.microsoft.com/office/drawing/2016/5/12/chartex" xmlns:cx7="http://schemas.microsoft.com/office/drawing/2016/5/13/chartex" xmlns:cx8="http://schemas.microsoft.com/office/drawing/2016/5/14/chartex" xmlns:mc="http://schemas.openxmlformats.org/markup-compatibility/2006" xmlns:aink="http://schemas.microsoft.com/office/drawing/2016/ink" xmlns:am3d="http://schemas.microsoft.com/office/drawing/2017/model3d" xmlns:o="urn:schemas-microsoft-com:office:office" xmlns:oel="http://schemas.microsoft.com/office/2019/extlst" xmlns:r="http://schemas.openxmlformats.org/officeDocument/2006/relationships" xmlns:m="http://schemas.openxmlformats.org/officeDocument/2006/math" xmlns:v="urn:schemas-microsoft-com:vml" xmlns:wp14="http://schemas.microsoft.com/office/word/2010/wordprocessingDrawing" xmlns:wp="http://schemas.openxmlformats.org/drawingml/2006/wordprocessingDrawing" xmlns:w10="urn:schemas-microsoft-com:office:word" xmlns:w="http://schemas.openxmlformats.org/wordprocessingml/2006/main" xmlns:w14="http://schemas.microsoft.com/office/word/2010/wordml" xmlns:w15="http://schemas.microsoft.com/office/word/2012/wordml" xmlns:w16cex="http://schemas.microsoft.com/office/word/2018/wordml/cex" xmlns:w16cid="http://schemas.microsoft.com/office/word/2016/wordml/cid" xmlns:w16="http://schemas.microsoft.com/office/word/2018/wordml" xmlns:w16du="http://schemas.microsoft.com/office/word/2023/wordml/word16du" xmlns:w16sdtdh="http://schemas.microsoft.com/office/word/2020/wordml/sdtdatahash" xmlns:w16sdtfl="http://schemas.microsoft.com/office/word/2024/wordml/sdtformatlock" xmlns:w16se="http://schemas.microsoft.com/office/word/2015/wordml/symex" xmlns:wpg="http://schemas.microsoft.com/office/word/2010/wordprocessingGroup" xmlns:wpi="http://schemas.microsoft.com/office/word/2010/wordprocessingInk" xmlns:wne="http://schemas.microsoft.com/office/word/2006/wordml" xmlns:wps="http://schemas.microsoft.com/office/word/2010/wordprocessingShape" mc:Ignorable="w14 w15 w16se w16cid w16 w16cex w16sdtdh w16sdtfl w16du wp14">
+<w:document xmlns:wpc="http://schemas.microsoft.com/office/word/2010/wordprocessingCanvas" xmlns:cx="http://schemas.microsoft.com/office/drawing/2014/chartex" xmlns:cx1="http://schemas.microsoft.com/office/drawing/2015/9/8/chartex" xmlns:cx2="http://schemas.microsoft.com/office/drawing/2015/10/21/chartex" xmlns:cx3="http://schemas.microsoft.com/office/drawing/2016/5/9/chartex" xmlns:cx4="http://schemas.microsoft.com/office/drawing/2016/5/10/chartex" xmlns:cx5="http://schemas.microsoft.com/office/drawing/2016/5/11/chartex" xmlns:cx6="http://schemas.microsoft.com/office/drawing/2016/5/12/chartex" xmlns:cx7="http://schemas.microsoft.com/office/drawing/2016/5/13/chartex" xmlns:cx8="http://schemas.microsoft.com/office/drawing/2016/5/14/chartex" xmlns:mc="http://schemas.openxmlformats.org/markup-compatibility/2006" xmlns:aink="http://schemas.microsoft.com/office/drawing/2016/ink" xmlns:am3d="http://schemas.microsoft.com/office/drawing/2017/model3d" xmlns:o="urn:schemas-microsoft-com:office:office" xmlns:oel="http://schemas.microsoft.com/office/2019/extlst" xmlns:r="http://schemas.openxmlformats.org/officeDocument/2006/relationships" xmlns:m="http://schemas.openxmlformats.org/officeDocument/2006/math" xmlns:v="urn:schemas-microsoft-com:vml" xmlns:wp14="http://schemas.microsoft.com/office/word/2010/wordprocessingDrawing" xmlns:wp="http://schemas.openxmlformats.org/drawingml/2006/wordprocessingDrawing" xmlns:w10="urn:schemas-microsoft-com:office:word" xmlns:w="http://schemas.openxmlformats.org/wordprocessingml/2006/main" xmlns:w14="http://schemas.microsoft.com/office/word/2010/wordml" xmlns:w15="http://schemas.microsoft.com/office/word/2012/wordml" xmlns:w16cei="http://schemas.microsoft.com/office/word/2026/wordml/cei" xmlns:w16cex="http://schemas.microsoft.com/office/word/2018/wordml/cex" xmlns:w16cid="http://schemas.microsoft.com/office/word/2016/wordml/cid" xmlns:w16="http://schemas.microsoft.com/office/word/2018/wordml" xmlns:w16du="http://schemas.microsoft.com/office/word/2023/wordml/word16du" xmlns:w16sdtdh="http://schemas.microsoft.com/office/word/2020/wordml/sdtdatahash" xmlns:w16sdtfl="http://schemas.microsoft.com/office/word/2024/wordml/sdtformatlock" xmlns:w16se="http://schemas.microsoft.com/office/word/2015/wordml/symex" xmlns:wpg="http://schemas.microsoft.com/office/word/2010/wordprocessingGroup" xmlns:wpi="http://schemas.microsoft.com/office/word/2010/wordprocessingInk" xmlns:wne="http://schemas.microsoft.com/office/word/2006/wordml" xmlns:wps="http://schemas.microsoft.com/office/word/2010/wordprocessingShape" mc:Ignorable="w14 w15 w16se w16cid w16 w16cex w16sdtdh w16sdtfl w16du wp14">
   <w:body>
     <w:p>
       <w:r>
@@ -84,11 +84,9 @@
             <w:hideMark/>
           </w:tcPr>
           <w:p>
-            <w:proofErr w:type="spellStart"/>
             <w:r>
               <w:t>Delivery_Status</w:t>
             </w:r>
-            <w:proofErr w:type="spellEnd"/>
           </w:p>
         </w:tc>
         <w:tc>
@@ -98,51 +96,9 @@
             <w:hideMark/>
           </w:tcPr>
           <w:p>
-            <w:proofErr w:type="spellStart"/>
-            <w:r>
-              <w:t>order_id</w:t>
-            </w:r>
-            <w:proofErr w:type="spellEnd"/>
-            <w:r>
-              <w:t xml:space="preserve">, </w:t>
-            </w:r>
-            <w:proofErr w:type="spellStart"/>
-            <w:r>
-              <w:t>dispatched_at</w:t>
-            </w:r>
-            <w:proofErr w:type="spellEnd"/>
-            <w:r>
-              <w:t xml:space="preserve">, </w:t>
-            </w:r>
-            <w:proofErr w:type="spellStart"/>
-            <w:r>
-              <w:t>delivered_at</w:t>
-            </w:r>
-            <w:proofErr w:type="spellEnd"/>
-            <w:r>
-              <w:t xml:space="preserve">, </w:t>
-            </w:r>
-            <w:proofErr w:type="spellStart"/>
-            <w:r>
-              <w:t>delivery_status</w:t>
-            </w:r>
-            <w:proofErr w:type="spellEnd"/>
-            <w:r>
-              <w:t xml:space="preserve">, </w:t>
-            </w:r>
-            <w:proofErr w:type="spellStart"/>
-            <w:r>
-              <w:t>delivery_owner</w:t>
-            </w:r>
-            <w:proofErr w:type="spellEnd"/>
-            <w:r>
-              <w:t xml:space="preserve">, </w:t>
-            </w:r>
-            <w:proofErr w:type="spellStart"/>
-            <w:r>
-              <w:t>updated_at</w:t>
-            </w:r>
-            <w:proofErr w:type="spellEnd"/>
+            <w:r>
+              <w:t>order_id, dispatched_at, delivered_at, delivery_status, delivery_owner, updated_at</w:t>
+            </w:r>
           </w:p>
         </w:tc>
       </w:tr>
@@ -169,27 +125,9 @@
             <w:hideMark/>
           </w:tcPr>
           <w:p>
-            <w:proofErr w:type="spellStart"/>
-            <w:r>
-              <w:t>payment_status</w:t>
-            </w:r>
-            <w:proofErr w:type="spellEnd"/>
-            <w:r>
-              <w:t xml:space="preserve">, </w:t>
-            </w:r>
-            <w:proofErr w:type="spellStart"/>
-            <w:r>
-              <w:t>payment_collected_at</w:t>
-            </w:r>
-            <w:proofErr w:type="spellEnd"/>
-            <w:r>
-              <w:t xml:space="preserve">, </w:t>
-            </w:r>
-            <w:proofErr w:type="spellStart"/>
-            <w:r>
-              <w:t>collected_amount</w:t>
-            </w:r>
-            <w:proofErr w:type="spellEnd"/>
+            <w:r>
+              <w:t>payment_status, payment_collected_at, collected_amount</w:t>
+            </w:r>
           </w:p>
         </w:tc>
       </w:tr>
@@ -204,11 +142,9 @@
             <w:hideMark/>
           </w:tcPr>
           <w:p>
-            <w:proofErr w:type="spellStart"/>
             <w:r>
               <w:t>Order_Items</w:t>
             </w:r>
-            <w:proofErr w:type="spellEnd"/>
           </w:p>
         </w:tc>
         <w:tc>
@@ -218,27 +154,9 @@
             <w:hideMark/>
           </w:tcPr>
           <w:p>
-            <w:proofErr w:type="spellStart"/>
-            <w:r>
-              <w:t>direct_fulfilment_cost</w:t>
-            </w:r>
-            <w:proofErr w:type="spellEnd"/>
-            <w:r>
-              <w:t xml:space="preserve">, </w:t>
-            </w:r>
-            <w:proofErr w:type="spellStart"/>
-            <w:r>
-              <w:t>packaging_cost</w:t>
-            </w:r>
-            <w:proofErr w:type="spellEnd"/>
-            <w:r>
-              <w:t xml:space="preserve">, </w:t>
-            </w:r>
-            <w:proofErr w:type="spellStart"/>
-            <w:r>
-              <w:t>delivery_cost</w:t>
-            </w:r>
-            <w:proofErr w:type="spellEnd"/>
+            <w:r>
+              <w:t>direct_fulfilment_cost, packaging_cost, delivery_cost</w:t>
+            </w:r>
           </w:p>
         </w:tc>
       </w:tr>
@@ -253,11 +171,9 @@
             <w:hideMark/>
           </w:tcPr>
           <w:p>
-            <w:proofErr w:type="spellStart"/>
             <w:r>
               <w:t>Customer_Master</w:t>
             </w:r>
-            <w:proofErr w:type="spellEnd"/>
           </w:p>
         </w:tc>
         <w:tc>
@@ -268,15 +184,7 @@
           </w:tcPr>
           <w:p>
             <w:r>
-              <w:t xml:space="preserve">Add/correct </w:t>
-            </w:r>
-            <w:proofErr w:type="spellStart"/>
-            <w:r>
-              <w:t>studio_id</w:t>
-            </w:r>
-            <w:proofErr w:type="spellEnd"/>
-            <w:r>
-              <w:t xml:space="preserve"> for registered customers</w:t>
+              <w:t>Add/correct studio_id for registered customers</w:t>
             </w:r>
           </w:p>
         </w:tc>
@@ -292,11 +200,9 @@
             <w:hideMark/>
           </w:tcPr>
           <w:p>
-            <w:proofErr w:type="spellStart"/>
             <w:r>
               <w:t>Guest_Master</w:t>
             </w:r>
-            <w:proofErr w:type="spellEnd"/>
           </w:p>
         </w:tc>
         <w:tc>
@@ -307,15 +213,7 @@
           </w:tcPr>
           <w:p>
             <w:r>
-              <w:t xml:space="preserve">Add/correct </w:t>
-            </w:r>
-            <w:proofErr w:type="spellStart"/>
-            <w:r>
-              <w:t>studio_id</w:t>
-            </w:r>
-            <w:proofErr w:type="spellEnd"/>
-            <w:r>
-              <w:t xml:space="preserve"> for guest customers</w:t>
+              <w:t>Add/correct studio_id for guest customers</w:t>
             </w:r>
           </w:p>
         </w:tc>
@@ -323,15 +221,7 @@
     </w:tbl>
     <w:p>
       <w:r>
-        <w:t xml:space="preserve">Automatically calculated in </w:t>
-      </w:r>
-      <w:proofErr w:type="spellStart"/>
-      <w:r>
-        <w:t>Order_Items</w:t>
-      </w:r>
-      <w:proofErr w:type="spellEnd"/>
-      <w:r>
-        <w:t>:</w:t>
+        <w:t>Automatically calculated in Order_Items:</w:t>
       </w:r>
     </w:p>
     <w:p>
@@ -341,11 +231,9 @@
           <w:numId w:val="2"/>
         </w:numPr>
       </w:pPr>
-      <w:proofErr w:type="spellStart"/>
       <w:r>
         <w:t>total_fulfilment_cost</w:t>
       </w:r>
-      <w:proofErr w:type="spellEnd"/>
     </w:p>
     <w:p>
       <w:pPr>
@@ -354,23 +242,13 @@
           <w:numId w:val="2"/>
         </w:numPr>
       </w:pPr>
-      <w:proofErr w:type="spellStart"/>
       <w:r>
         <w:t>nia_contribution_margin</w:t>
       </w:r>
-      <w:proofErr w:type="spellEnd"/>
     </w:p>
     <w:p>
       <w:r>
-        <w:t xml:space="preserve">Important: use the existing </w:t>
-      </w:r>
-      <w:proofErr w:type="spellStart"/>
-      <w:r>
-        <w:t>order_id</w:t>
-      </w:r>
-      <w:proofErr w:type="spellEnd"/>
-      <w:r>
-        <w:t xml:space="preserve">, customer ID or guest ID to update the correct record. After updating, click </w:t>
+        <w:t xml:space="preserve">Important: use the existing order_id, customer ID or guest ID to update the correct record. After updating, click </w:t>
       </w:r>
       <w:r>
         <w:rPr>
@@ -490,7 +368,6 @@
             <w:hideMark/>
           </w:tcPr>
           <w:p>
-            <w:proofErr w:type="spellStart"/>
             <w:r>
               <w:rPr>
                 <w:b/>
@@ -498,7 +375,6 @@
               </w:rPr>
               <w:t>Self Learn</w:t>
             </w:r>
-            <w:proofErr w:type="spellEnd"/>
           </w:p>
         </w:tc>
         <w:tc>
@@ -541,7 +417,6 @@
             <w:hideMark/>
           </w:tcPr>
           <w:p>
-            <w:proofErr w:type="spellStart"/>
             <w:r>
               <w:rPr>
                 <w:b/>
@@ -549,7 +424,6 @@
               </w:rPr>
               <w:t>Self Drive</w:t>
             </w:r>
-            <w:proofErr w:type="spellEnd"/>
           </w:p>
         </w:tc>
         <w:tc>
@@ -639,7 +513,6 @@
             <w:hideMark/>
           </w:tcPr>
           <w:p>
-            <w:proofErr w:type="spellStart"/>
             <w:r>
               <w:rPr>
                 <w:b/>
@@ -647,7 +520,6 @@
               </w:rPr>
               <w:t>Self Drive</w:t>
             </w:r>
-            <w:proofErr w:type="spellEnd"/>
           </w:p>
         </w:tc>
         <w:tc>
@@ -690,7 +562,6 @@
             <w:hideMark/>
           </w:tcPr>
           <w:p>
-            <w:proofErr w:type="spellStart"/>
             <w:r>
               <w:rPr>
                 <w:b/>
@@ -698,7 +569,6 @@
               </w:rPr>
               <w:t>Self Drive</w:t>
             </w:r>
-            <w:proofErr w:type="spellEnd"/>
           </w:p>
         </w:tc>
         <w:tc>
@@ -741,7 +611,6 @@
             <w:hideMark/>
           </w:tcPr>
           <w:p>
-            <w:proofErr w:type="spellStart"/>
             <w:r>
               <w:rPr>
                 <w:b/>
@@ -749,7 +618,6 @@
               </w:rPr>
               <w:t>Self Drive</w:t>
             </w:r>
-            <w:proofErr w:type="spellEnd"/>
           </w:p>
         </w:tc>
         <w:tc>
@@ -884,13 +752,8 @@
       </w:r>
     </w:p>
     <w:p>
-      <w:proofErr w:type="spellStart"/>
       <w:r>
-        <w:t>Self Learn</w:t>
-      </w:r>
-      <w:proofErr w:type="spellEnd"/>
-      <w:r>
-        <w:t xml:space="preserve"> → Essentials is therefore the primary page for checking the raw operational results from this connected Sheet.</w:t>
+        <w:t>Self Learn → Essentials is therefore the primary page for checking the raw operational results from this connected Sheet.</w:t>
       </w:r>
     </w:p>
     <w:p/>
@@ -898,7 +761,7 @@
       <w:r>
         <w:t xml:space="preserve">User Input Sheet - </w:t>
       </w:r>
-      <w:hyperlink r:id="rId5" w:history="1">
+      <w:hyperlink r:id="rId5" w:anchor="gid=0" w:history="1">
         <w:r>
           <w:rPr>
             <w:rStyle w:val="Hyperlink"/>
@@ -914,47 +777,7 @@
       </w:r>
       <w:r>
         <w:br/>
-        <w:t xml:space="preserve">Shrey </w:t>
-      </w:r>
-      <w:proofErr w:type="spellStart"/>
-      <w:r>
-        <w:t>ke</w:t>
-      </w:r>
-      <w:proofErr w:type="spellEnd"/>
-      <w:r>
-        <w:t xml:space="preserve"> sheet me </w:t>
-      </w:r>
-      <w:proofErr w:type="spellStart"/>
-      <w:r>
-        <w:t>Fono</w:t>
-      </w:r>
-      <w:proofErr w:type="spellEnd"/>
-      <w:r>
-        <w:t xml:space="preserve"> </w:t>
-      </w:r>
-      <w:proofErr w:type="spellStart"/>
-      <w:r>
-        <w:t>Funnle</w:t>
-      </w:r>
-      <w:proofErr w:type="spellEnd"/>
-      <w:r>
-        <w:t xml:space="preserve"> tab me ye </w:t>
-      </w:r>
-      <w:proofErr w:type="spellStart"/>
-      <w:r>
-        <w:t>hona</w:t>
-      </w:r>
-      <w:proofErr w:type="spellEnd"/>
-      <w:r>
-        <w:t xml:space="preserve"> </w:t>
-      </w:r>
-      <w:proofErr w:type="spellStart"/>
-      <w:r>
-        <w:t>chiye</w:t>
-      </w:r>
-      <w:proofErr w:type="spellEnd"/>
-      <w:r>
-        <w:t xml:space="preserve"> </w:t>
+        <w:t xml:space="preserve">Shrey ke sheet me Fono Funnle tab me ye hona chiye </w:t>
       </w:r>
     </w:p>
     <w:tbl>
@@ -1039,6 +862,1761 @@
         <w:t xml:space="preserve">Visted </w:t>
       </w:r>
     </w:p>
+    <w:p/>
+    <w:p/>
+    <w:p/>
+    <w:p>
+      <w:r>
+        <w:t>Vertical Owner in Dashboard :</w:t>
+      </w:r>
+      <w:r>
+        <w:br/>
+      </w:r>
+      <w:r>
+        <w:br/>
+      </w:r>
+    </w:p>
+    <w:tbl>
+      <w:tblPr>
+        <w:tblW w:w="17740" w:type="dxa"/>
+        <w:tblLook w:val="04A0" w:firstRow="1" w:lastRow="0" w:firstColumn="1" w:lastColumn="0" w:noHBand="0" w:noVBand="1"/>
+      </w:tblPr>
+      <w:tblGrid>
+        <w:gridCol w:w="1860"/>
+        <w:gridCol w:w="9140"/>
+        <w:gridCol w:w="6740"/>
+      </w:tblGrid>
+      <w:tr>
+        <w:trPr>
+          <w:trHeight w:val="288"/>
+        </w:trPr>
+        <w:tc>
+          <w:tcPr>
+            <w:tcW w:w="1860" w:type="dxa"/>
+            <w:tcBorders>
+              <w:top w:val="single" w:sz="4" w:space="0" w:color="auto"/>
+              <w:left w:val="single" w:sz="4" w:space="0" w:color="auto"/>
+              <w:bottom w:val="single" w:sz="4" w:space="0" w:color="auto"/>
+              <w:right w:val="single" w:sz="4" w:space="0" w:color="auto"/>
+            </w:tcBorders>
+            <w:vAlign w:val="center"/>
+            <w:hideMark/>
+          </w:tcPr>
+          <w:p>
+            <w:pPr>
+              <w:spacing w:after="0" w:line="240" w:lineRule="auto"/>
+              <w:jc w:val="center"/>
+              <w:rPr>
+                <w:rFonts w:ascii="Calibri" w:eastAsia="Times New Roman" w:hAnsi="Calibri" w:cs="Calibri"/>
+                <w:b/>
+                <w:bCs/>
+                <w:color w:val="000000"/>
+                <w:kern w:val="0"/>
+                <w:sz w:val="22"/>
+                <w:szCs w:val="22"/>
+                <w:lang w:eastAsia="en-IN"/>
+                <w14:ligatures w14:val="none"/>
+              </w:rPr>
+            </w:pPr>
+            <w:r>
+              <w:rPr>
+                <w:rFonts w:ascii="Calibri" w:eastAsia="Times New Roman" w:hAnsi="Calibri" w:cs="Calibri"/>
+                <w:b/>
+                <w:bCs/>
+                <w:color w:val="000000"/>
+                <w:kern w:val="0"/>
+                <w:sz w:val="22"/>
+                <w:szCs w:val="22"/>
+                <w:lang w:eastAsia="en-IN"/>
+                <w14:ligatures w14:val="none"/>
+              </w:rPr>
+              <w:t>Vertical</w:t>
+            </w:r>
+          </w:p>
+        </w:tc>
+        <w:tc>
+          <w:tcPr>
+            <w:tcW w:w="9140" w:type="dxa"/>
+            <w:tcBorders>
+              <w:top w:val="single" w:sz="4" w:space="0" w:color="auto"/>
+              <w:left w:val="nil"/>
+              <w:bottom w:val="single" w:sz="4" w:space="0" w:color="auto"/>
+              <w:right w:val="single" w:sz="4" w:space="0" w:color="auto"/>
+            </w:tcBorders>
+            <w:vAlign w:val="center"/>
+            <w:hideMark/>
+          </w:tcPr>
+          <w:p>
+            <w:pPr>
+              <w:spacing w:after="0" w:line="240" w:lineRule="auto"/>
+              <w:jc w:val="center"/>
+              <w:rPr>
+                <w:rFonts w:ascii="Calibri" w:eastAsia="Times New Roman" w:hAnsi="Calibri" w:cs="Calibri"/>
+                <w:b/>
+                <w:bCs/>
+                <w:color w:val="000000"/>
+                <w:kern w:val="0"/>
+                <w:sz w:val="22"/>
+                <w:szCs w:val="22"/>
+                <w:lang w:eastAsia="en-IN"/>
+                <w14:ligatures w14:val="none"/>
+              </w:rPr>
+            </w:pPr>
+            <w:r>
+              <w:rPr>
+                <w:rFonts w:ascii="Calibri" w:eastAsia="Times New Roman" w:hAnsi="Calibri" w:cs="Calibri"/>
+                <w:b/>
+                <w:bCs/>
+                <w:color w:val="000000"/>
+                <w:kern w:val="0"/>
+                <w:sz w:val="22"/>
+                <w:szCs w:val="22"/>
+                <w:lang w:eastAsia="en-IN"/>
+                <w14:ligatures w14:val="none"/>
+              </w:rPr>
+              <w:t>Primary Owner</w:t>
+            </w:r>
+          </w:p>
+        </w:tc>
+        <w:tc>
+          <w:tcPr>
+            <w:tcW w:w="6740" w:type="dxa"/>
+            <w:tcBorders>
+              <w:top w:val="single" w:sz="4" w:space="0" w:color="auto"/>
+              <w:left w:val="nil"/>
+              <w:bottom w:val="single" w:sz="4" w:space="0" w:color="auto"/>
+              <w:right w:val="single" w:sz="4" w:space="0" w:color="auto"/>
+            </w:tcBorders>
+            <w:vAlign w:val="center"/>
+            <w:hideMark/>
+          </w:tcPr>
+          <w:p>
+            <w:pPr>
+              <w:spacing w:after="0" w:line="240" w:lineRule="auto"/>
+              <w:jc w:val="center"/>
+              <w:rPr>
+                <w:rFonts w:ascii="Calibri" w:eastAsia="Times New Roman" w:hAnsi="Calibri" w:cs="Calibri"/>
+                <w:b/>
+                <w:bCs/>
+                <w:color w:val="000000"/>
+                <w:kern w:val="0"/>
+                <w:sz w:val="22"/>
+                <w:szCs w:val="22"/>
+                <w:lang w:eastAsia="en-IN"/>
+                <w14:ligatures w14:val="none"/>
+              </w:rPr>
+            </w:pPr>
+            <w:r>
+              <w:rPr>
+                <w:rFonts w:ascii="Calibri" w:eastAsia="Times New Roman" w:hAnsi="Calibri" w:cs="Calibri"/>
+                <w:b/>
+                <w:bCs/>
+                <w:color w:val="000000"/>
+                <w:kern w:val="0"/>
+                <w:sz w:val="22"/>
+                <w:szCs w:val="22"/>
+                <w:lang w:eastAsia="en-IN"/>
+                <w14:ligatures w14:val="none"/>
+              </w:rPr>
+              <w:t>Business Responsibility</w:t>
+            </w:r>
+          </w:p>
+        </w:tc>
+      </w:tr>
+      <w:tr>
+        <w:trPr>
+          <w:trHeight w:val="576"/>
+        </w:trPr>
+        <w:tc>
+          <w:tcPr>
+            <w:tcW w:w="1860" w:type="dxa"/>
+            <w:tcBorders>
+              <w:top w:val="nil"/>
+              <w:left w:val="single" w:sz="4" w:space="0" w:color="auto"/>
+              <w:bottom w:val="single" w:sz="4" w:space="0" w:color="auto"/>
+              <w:right w:val="single" w:sz="4" w:space="0" w:color="auto"/>
+            </w:tcBorders>
+            <w:vAlign w:val="center"/>
+            <w:hideMark/>
+          </w:tcPr>
+          <w:p>
+            <w:pPr>
+              <w:spacing w:after="0" w:line="240" w:lineRule="auto"/>
+              <w:jc w:val="center"/>
+              <w:rPr>
+                <w:rFonts w:ascii="Calibri" w:eastAsia="Times New Roman" w:hAnsi="Calibri" w:cs="Calibri"/>
+                <w:b/>
+                <w:bCs/>
+                <w:color w:val="000000"/>
+                <w:kern w:val="0"/>
+                <w:sz w:val="22"/>
+                <w:szCs w:val="22"/>
+                <w:lang w:eastAsia="en-IN"/>
+                <w14:ligatures w14:val="none"/>
+              </w:rPr>
+            </w:pPr>
+            <w:r>
+              <w:rPr>
+                <w:rFonts w:ascii="Calibri" w:eastAsia="Times New Roman" w:hAnsi="Calibri" w:cs="Calibri"/>
+                <w:b/>
+                <w:bCs/>
+                <w:color w:val="000000"/>
+                <w:kern w:val="0"/>
+                <w:sz w:val="22"/>
+                <w:szCs w:val="22"/>
+                <w:lang w:eastAsia="en-IN"/>
+                <w14:ligatures w14:val="none"/>
+              </w:rPr>
+              <w:t>Occupancy</w:t>
+            </w:r>
+          </w:p>
+        </w:tc>
+        <w:tc>
+          <w:tcPr>
+            <w:tcW w:w="9140" w:type="dxa"/>
+            <w:tcBorders>
+              <w:top w:val="nil"/>
+              <w:left w:val="nil"/>
+              <w:bottom w:val="single" w:sz="4" w:space="0" w:color="auto"/>
+              <w:right w:val="single" w:sz="4" w:space="0" w:color="auto"/>
+            </w:tcBorders>
+            <w:vAlign w:val="center"/>
+            <w:hideMark/>
+          </w:tcPr>
+          <w:p>
+            <w:pPr>
+              <w:spacing w:after="0" w:line="240" w:lineRule="auto"/>
+              <w:jc w:val="center"/>
+              <w:rPr>
+                <w:rFonts w:ascii="Calibri" w:eastAsia="Times New Roman" w:hAnsi="Calibri" w:cs="Calibri"/>
+                <w:b/>
+                <w:bCs/>
+                <w:color w:val="000000"/>
+                <w:kern w:val="0"/>
+                <w:sz w:val="22"/>
+                <w:szCs w:val="22"/>
+                <w:lang w:eastAsia="en-IN"/>
+                <w14:ligatures w14:val="none"/>
+              </w:rPr>
+            </w:pPr>
+            <w:r>
+              <w:rPr>
+                <w:rFonts w:ascii="Calibri" w:eastAsia="Times New Roman" w:hAnsi="Calibri" w:cs="Calibri"/>
+                <w:b/>
+                <w:bCs/>
+                <w:color w:val="000000"/>
+                <w:kern w:val="0"/>
+                <w:sz w:val="22"/>
+                <w:szCs w:val="22"/>
+                <w:lang w:eastAsia="en-IN"/>
+                <w14:ligatures w14:val="none"/>
+              </w:rPr>
+              <w:t>Prashant Waghire</w:t>
+            </w:r>
+          </w:p>
+        </w:tc>
+        <w:tc>
+          <w:tcPr>
+            <w:tcW w:w="6740" w:type="dxa"/>
+            <w:tcBorders>
+              <w:top w:val="nil"/>
+              <w:left w:val="nil"/>
+              <w:bottom w:val="single" w:sz="4" w:space="0" w:color="auto"/>
+              <w:right w:val="single" w:sz="4" w:space="0" w:color="auto"/>
+            </w:tcBorders>
+            <w:vAlign w:val="center"/>
+            <w:hideMark/>
+          </w:tcPr>
+          <w:p>
+            <w:pPr>
+              <w:spacing w:after="0" w:line="240" w:lineRule="auto"/>
+              <w:jc w:val="center"/>
+              <w:rPr>
+                <w:rFonts w:ascii="Calibri" w:eastAsia="Times New Roman" w:hAnsi="Calibri" w:cs="Calibri"/>
+                <w:color w:val="000000"/>
+                <w:kern w:val="0"/>
+                <w:sz w:val="22"/>
+                <w:szCs w:val="22"/>
+                <w:lang w:eastAsia="en-IN"/>
+                <w14:ligatures w14:val="none"/>
+              </w:rPr>
+            </w:pPr>
+            <w:r>
+              <w:rPr>
+                <w:rFonts w:ascii="Calibri" w:eastAsia="Times New Roman" w:hAnsi="Calibri" w:cs="Calibri"/>
+                <w:color w:val="000000"/>
+                <w:kern w:val="0"/>
+                <w:sz w:val="22"/>
+                <w:szCs w:val="22"/>
+                <w:lang w:eastAsia="en-IN"/>
+                <w14:ligatures w14:val="none"/>
+              </w:rPr>
+              <w:t>Accountable for driving occupancy growth, improving occupancy %, and achieving the business targets for the Occupancy vertical.</w:t>
+            </w:r>
+          </w:p>
+        </w:tc>
+      </w:tr>
+      <w:tr>
+        <w:trPr>
+          <w:trHeight w:val="576"/>
+        </w:trPr>
+        <w:tc>
+          <w:tcPr>
+            <w:tcW w:w="1860" w:type="dxa"/>
+            <w:tcBorders>
+              <w:top w:val="nil"/>
+              <w:left w:val="single" w:sz="4" w:space="0" w:color="auto"/>
+              <w:bottom w:val="single" w:sz="4" w:space="0" w:color="auto"/>
+              <w:right w:val="single" w:sz="4" w:space="0" w:color="auto"/>
+            </w:tcBorders>
+            <w:vAlign w:val="center"/>
+            <w:hideMark/>
+          </w:tcPr>
+          <w:p>
+            <w:pPr>
+              <w:spacing w:after="0" w:line="240" w:lineRule="auto"/>
+              <w:jc w:val="center"/>
+              <w:rPr>
+                <w:rFonts w:ascii="Calibri" w:eastAsia="Times New Roman" w:hAnsi="Calibri" w:cs="Calibri"/>
+                <w:b/>
+                <w:bCs/>
+                <w:color w:val="000000"/>
+                <w:kern w:val="0"/>
+                <w:sz w:val="22"/>
+                <w:szCs w:val="22"/>
+                <w:lang w:eastAsia="en-IN"/>
+                <w14:ligatures w14:val="none"/>
+              </w:rPr>
+            </w:pPr>
+            <w:r>
+              <w:rPr>
+                <w:rFonts w:ascii="Calibri" w:eastAsia="Times New Roman" w:hAnsi="Calibri" w:cs="Calibri"/>
+                <w:b/>
+                <w:bCs/>
+                <w:color w:val="000000"/>
+                <w:kern w:val="0"/>
+                <w:sz w:val="22"/>
+                <w:szCs w:val="22"/>
+                <w:lang w:eastAsia="en-IN"/>
+                <w14:ligatures w14:val="none"/>
+              </w:rPr>
+              <w:t>Essential Supply</w:t>
+            </w:r>
+          </w:p>
+        </w:tc>
+        <w:tc>
+          <w:tcPr>
+            <w:tcW w:w="9140" w:type="dxa"/>
+            <w:tcBorders>
+              <w:top w:val="nil"/>
+              <w:left w:val="nil"/>
+              <w:bottom w:val="single" w:sz="4" w:space="0" w:color="auto"/>
+              <w:right w:val="single" w:sz="4" w:space="0" w:color="auto"/>
+            </w:tcBorders>
+            <w:vAlign w:val="center"/>
+            <w:hideMark/>
+          </w:tcPr>
+          <w:p>
+            <w:pPr>
+              <w:spacing w:after="0" w:line="240" w:lineRule="auto"/>
+              <w:jc w:val="center"/>
+              <w:rPr>
+                <w:rFonts w:ascii="Calibri" w:eastAsia="Times New Roman" w:hAnsi="Calibri" w:cs="Calibri"/>
+                <w:b/>
+                <w:bCs/>
+                <w:color w:val="000000"/>
+                <w:kern w:val="0"/>
+                <w:sz w:val="22"/>
+                <w:szCs w:val="22"/>
+                <w:lang w:eastAsia="en-IN"/>
+                <w14:ligatures w14:val="none"/>
+              </w:rPr>
+            </w:pPr>
+            <w:r>
+              <w:rPr>
+                <w:rFonts w:ascii="Calibri" w:eastAsia="Times New Roman" w:hAnsi="Calibri" w:cs="Calibri"/>
+                <w:b/>
+                <w:bCs/>
+                <w:color w:val="000000"/>
+                <w:kern w:val="0"/>
+                <w:sz w:val="22"/>
+                <w:szCs w:val="22"/>
+                <w:lang w:eastAsia="en-IN"/>
+                <w14:ligatures w14:val="none"/>
+              </w:rPr>
+              <w:t>Manikya Dahed</w:t>
+            </w:r>
+          </w:p>
+        </w:tc>
+        <w:tc>
+          <w:tcPr>
+            <w:tcW w:w="6740" w:type="dxa"/>
+            <w:tcBorders>
+              <w:top w:val="nil"/>
+              <w:left w:val="nil"/>
+              <w:bottom w:val="single" w:sz="4" w:space="0" w:color="auto"/>
+              <w:right w:val="single" w:sz="4" w:space="0" w:color="auto"/>
+            </w:tcBorders>
+            <w:vAlign w:val="center"/>
+            <w:hideMark/>
+          </w:tcPr>
+          <w:p>
+            <w:pPr>
+              <w:spacing w:after="0" w:line="240" w:lineRule="auto"/>
+              <w:jc w:val="center"/>
+              <w:rPr>
+                <w:rFonts w:ascii="Calibri" w:eastAsia="Times New Roman" w:hAnsi="Calibri" w:cs="Calibri"/>
+                <w:color w:val="000000"/>
+                <w:kern w:val="0"/>
+                <w:sz w:val="22"/>
+                <w:szCs w:val="22"/>
+                <w:lang w:eastAsia="en-IN"/>
+                <w14:ligatures w14:val="none"/>
+              </w:rPr>
+            </w:pPr>
+            <w:r>
+              <w:rPr>
+                <w:rFonts w:ascii="Calibri" w:eastAsia="Times New Roman" w:hAnsi="Calibri" w:cs="Calibri"/>
+                <w:color w:val="000000"/>
+                <w:kern w:val="0"/>
+                <w:sz w:val="22"/>
+                <w:szCs w:val="22"/>
+                <w:lang w:eastAsia="en-IN"/>
+                <w14:ligatures w14:val="none"/>
+              </w:rPr>
+              <w:t>Accountable for increasing supply, ensuring product availability, and achieving the business targets for the Essentials Supply vertical.</w:t>
+            </w:r>
+          </w:p>
+        </w:tc>
+      </w:tr>
+      <w:tr>
+        <w:trPr>
+          <w:trHeight w:val="576"/>
+        </w:trPr>
+        <w:tc>
+          <w:tcPr>
+            <w:tcW w:w="1860" w:type="dxa"/>
+            <w:tcBorders>
+              <w:top w:val="nil"/>
+              <w:left w:val="single" w:sz="4" w:space="0" w:color="auto"/>
+              <w:bottom w:val="single" w:sz="4" w:space="0" w:color="auto"/>
+              <w:right w:val="single" w:sz="4" w:space="0" w:color="auto"/>
+            </w:tcBorders>
+            <w:vAlign w:val="center"/>
+            <w:hideMark/>
+          </w:tcPr>
+          <w:p>
+            <w:pPr>
+              <w:spacing w:after="0" w:line="240" w:lineRule="auto"/>
+              <w:jc w:val="center"/>
+              <w:rPr>
+                <w:rFonts w:ascii="Calibri" w:eastAsia="Times New Roman" w:hAnsi="Calibri" w:cs="Calibri"/>
+                <w:b/>
+                <w:bCs/>
+                <w:color w:val="000000"/>
+                <w:kern w:val="0"/>
+                <w:sz w:val="22"/>
+                <w:szCs w:val="22"/>
+                <w:lang w:eastAsia="en-IN"/>
+                <w14:ligatures w14:val="none"/>
+              </w:rPr>
+            </w:pPr>
+            <w:r>
+              <w:rPr>
+                <w:rFonts w:ascii="Calibri" w:eastAsia="Times New Roman" w:hAnsi="Calibri" w:cs="Calibri"/>
+                <w:b/>
+                <w:bCs/>
+                <w:color w:val="000000"/>
+                <w:kern w:val="0"/>
+                <w:sz w:val="22"/>
+                <w:szCs w:val="22"/>
+                <w:lang w:eastAsia="en-IN"/>
+                <w14:ligatures w14:val="none"/>
+              </w:rPr>
+              <w:t>Essential Demand</w:t>
+            </w:r>
+          </w:p>
+        </w:tc>
+        <w:tc>
+          <w:tcPr>
+            <w:tcW w:w="9140" w:type="dxa"/>
+            <w:tcBorders>
+              <w:top w:val="nil"/>
+              <w:left w:val="nil"/>
+              <w:bottom w:val="single" w:sz="4" w:space="0" w:color="auto"/>
+              <w:right w:val="single" w:sz="4" w:space="0" w:color="auto"/>
+            </w:tcBorders>
+            <w:vAlign w:val="center"/>
+            <w:hideMark/>
+          </w:tcPr>
+          <w:p>
+            <w:pPr>
+              <w:spacing w:after="0" w:line="240" w:lineRule="auto"/>
+              <w:jc w:val="center"/>
+              <w:rPr>
+                <w:rFonts w:ascii="Calibri" w:eastAsia="Times New Roman" w:hAnsi="Calibri" w:cs="Calibri"/>
+                <w:b/>
+                <w:bCs/>
+                <w:color w:val="000000"/>
+                <w:kern w:val="0"/>
+                <w:sz w:val="22"/>
+                <w:szCs w:val="22"/>
+                <w:lang w:eastAsia="en-IN"/>
+                <w14:ligatures w14:val="none"/>
+              </w:rPr>
+            </w:pPr>
+            <w:r>
+              <w:rPr>
+                <w:rFonts w:ascii="Calibri" w:eastAsia="Times New Roman" w:hAnsi="Calibri" w:cs="Calibri"/>
+                <w:b/>
+                <w:bCs/>
+                <w:color w:val="000000"/>
+                <w:kern w:val="0"/>
+                <w:sz w:val="22"/>
+                <w:szCs w:val="22"/>
+                <w:lang w:eastAsia="en-IN"/>
+                <w14:ligatures w14:val="none"/>
+              </w:rPr>
+              <w:t>Satish Sanghey</w:t>
+            </w:r>
+          </w:p>
+        </w:tc>
+        <w:tc>
+          <w:tcPr>
+            <w:tcW w:w="6740" w:type="dxa"/>
+            <w:tcBorders>
+              <w:top w:val="nil"/>
+              <w:left w:val="nil"/>
+              <w:bottom w:val="single" w:sz="4" w:space="0" w:color="auto"/>
+              <w:right w:val="single" w:sz="4" w:space="0" w:color="auto"/>
+            </w:tcBorders>
+            <w:vAlign w:val="center"/>
+            <w:hideMark/>
+          </w:tcPr>
+          <w:p>
+            <w:pPr>
+              <w:spacing w:after="0" w:line="240" w:lineRule="auto"/>
+              <w:jc w:val="center"/>
+              <w:rPr>
+                <w:rFonts w:ascii="Calibri" w:eastAsia="Times New Roman" w:hAnsi="Calibri" w:cs="Calibri"/>
+                <w:color w:val="000000"/>
+                <w:kern w:val="0"/>
+                <w:sz w:val="22"/>
+                <w:szCs w:val="22"/>
+                <w:lang w:eastAsia="en-IN"/>
+                <w14:ligatures w14:val="none"/>
+              </w:rPr>
+            </w:pPr>
+            <w:r>
+              <w:rPr>
+                <w:rFonts w:ascii="Calibri" w:eastAsia="Times New Roman" w:hAnsi="Calibri" w:cs="Calibri"/>
+                <w:color w:val="000000"/>
+                <w:kern w:val="0"/>
+                <w:sz w:val="22"/>
+                <w:szCs w:val="22"/>
+                <w:lang w:eastAsia="en-IN"/>
+                <w14:ligatures w14:val="none"/>
+              </w:rPr>
+              <w:t>Accountable for driving customer demand, improving conversions, and achieving the business targets for the Essentials Demand vertical.</w:t>
+            </w:r>
+          </w:p>
+        </w:tc>
+      </w:tr>
+      <w:tr>
+        <w:trPr>
+          <w:trHeight w:val="864"/>
+        </w:trPr>
+        <w:tc>
+          <w:tcPr>
+            <w:tcW w:w="1860" w:type="dxa"/>
+            <w:tcBorders>
+              <w:top w:val="nil"/>
+              <w:left w:val="single" w:sz="4" w:space="0" w:color="auto"/>
+              <w:bottom w:val="single" w:sz="4" w:space="0" w:color="auto"/>
+              <w:right w:val="single" w:sz="4" w:space="0" w:color="auto"/>
+            </w:tcBorders>
+            <w:vAlign w:val="center"/>
+            <w:hideMark/>
+          </w:tcPr>
+          <w:p>
+            <w:pPr>
+              <w:spacing w:after="0" w:line="240" w:lineRule="auto"/>
+              <w:jc w:val="center"/>
+              <w:rPr>
+                <w:rFonts w:ascii="Calibri" w:eastAsia="Times New Roman" w:hAnsi="Calibri" w:cs="Calibri"/>
+                <w:b/>
+                <w:bCs/>
+                <w:color w:val="000000"/>
+                <w:kern w:val="0"/>
+                <w:sz w:val="22"/>
+                <w:szCs w:val="22"/>
+                <w:lang w:eastAsia="en-IN"/>
+                <w14:ligatures w14:val="none"/>
+              </w:rPr>
+            </w:pPr>
+            <w:r>
+              <w:rPr>
+                <w:rFonts w:ascii="Calibri" w:eastAsia="Times New Roman" w:hAnsi="Calibri" w:cs="Calibri"/>
+                <w:b/>
+                <w:bCs/>
+                <w:color w:val="000000"/>
+                <w:kern w:val="0"/>
+                <w:sz w:val="22"/>
+                <w:szCs w:val="22"/>
+                <w:lang w:eastAsia="en-IN"/>
+                <w14:ligatures w14:val="none"/>
+              </w:rPr>
+              <w:t>FONO Demand</w:t>
+            </w:r>
+          </w:p>
+        </w:tc>
+        <w:tc>
+          <w:tcPr>
+            <w:tcW w:w="9140" w:type="dxa"/>
+            <w:tcBorders>
+              <w:top w:val="nil"/>
+              <w:left w:val="nil"/>
+              <w:bottom w:val="single" w:sz="4" w:space="0" w:color="auto"/>
+              <w:right w:val="single" w:sz="4" w:space="0" w:color="auto"/>
+            </w:tcBorders>
+            <w:vAlign w:val="center"/>
+            <w:hideMark/>
+          </w:tcPr>
+          <w:p>
+            <w:pPr>
+              <w:spacing w:after="0" w:line="240" w:lineRule="auto"/>
+              <w:jc w:val="center"/>
+              <w:rPr>
+                <w:rFonts w:ascii="Calibri" w:eastAsia="Times New Roman" w:hAnsi="Calibri" w:cs="Calibri"/>
+                <w:b/>
+                <w:bCs/>
+                <w:color w:val="000000"/>
+                <w:kern w:val="0"/>
+                <w:sz w:val="22"/>
+                <w:szCs w:val="22"/>
+                <w:lang w:eastAsia="en-IN"/>
+                <w14:ligatures w14:val="none"/>
+              </w:rPr>
+            </w:pPr>
+            <w:r>
+              <w:rPr>
+                <w:rFonts w:ascii="Calibri" w:eastAsia="Times New Roman" w:hAnsi="Calibri" w:cs="Calibri"/>
+                <w:b/>
+                <w:bCs/>
+                <w:color w:val="000000"/>
+                <w:kern w:val="0"/>
+                <w:sz w:val="22"/>
+                <w:szCs w:val="22"/>
+                <w:lang w:eastAsia="en-IN"/>
+                <w14:ligatures w14:val="none"/>
+              </w:rPr>
+              <w:t>Srinivasan RG</w:t>
+            </w:r>
+          </w:p>
+        </w:tc>
+        <w:tc>
+          <w:tcPr>
+            <w:tcW w:w="6740" w:type="dxa"/>
+            <w:tcBorders>
+              <w:top w:val="nil"/>
+              <w:left w:val="nil"/>
+              <w:bottom w:val="single" w:sz="4" w:space="0" w:color="auto"/>
+              <w:right w:val="single" w:sz="4" w:space="0" w:color="auto"/>
+            </w:tcBorders>
+            <w:vAlign w:val="center"/>
+            <w:hideMark/>
+          </w:tcPr>
+          <w:p>
+            <w:pPr>
+              <w:spacing w:after="0" w:line="240" w:lineRule="auto"/>
+              <w:jc w:val="center"/>
+              <w:rPr>
+                <w:rFonts w:ascii="Calibri" w:eastAsia="Times New Roman" w:hAnsi="Calibri" w:cs="Calibri"/>
+                <w:color w:val="000000"/>
+                <w:kern w:val="0"/>
+                <w:sz w:val="22"/>
+                <w:szCs w:val="22"/>
+                <w:lang w:eastAsia="en-IN"/>
+                <w14:ligatures w14:val="none"/>
+              </w:rPr>
+            </w:pPr>
+            <w:r>
+              <w:rPr>
+                <w:rFonts w:ascii="Calibri" w:eastAsia="Times New Roman" w:hAnsi="Calibri" w:cs="Calibri"/>
+                <w:color w:val="000000"/>
+                <w:kern w:val="0"/>
+                <w:sz w:val="22"/>
+                <w:szCs w:val="22"/>
+                <w:lang w:eastAsia="en-IN"/>
+                <w14:ligatures w14:val="none"/>
+              </w:rPr>
+              <w:t>Accountable for generating FONO demand, improving funnel performance, and achieving the business targets for the FONO Demand vertical.</w:t>
+            </w:r>
+          </w:p>
+        </w:tc>
+      </w:tr>
+      <w:tr>
+        <w:trPr>
+          <w:trHeight w:val="576"/>
+        </w:trPr>
+        <w:tc>
+          <w:tcPr>
+            <w:tcW w:w="1860" w:type="dxa"/>
+            <w:tcBorders>
+              <w:top w:val="nil"/>
+              <w:left w:val="single" w:sz="4" w:space="0" w:color="auto"/>
+              <w:bottom w:val="single" w:sz="4" w:space="0" w:color="auto"/>
+              <w:right w:val="single" w:sz="4" w:space="0" w:color="auto"/>
+            </w:tcBorders>
+            <w:vAlign w:val="center"/>
+            <w:hideMark/>
+          </w:tcPr>
+          <w:p>
+            <w:pPr>
+              <w:spacing w:after="0" w:line="240" w:lineRule="auto"/>
+              <w:jc w:val="center"/>
+              <w:rPr>
+                <w:rFonts w:ascii="Calibri" w:eastAsia="Times New Roman" w:hAnsi="Calibri" w:cs="Calibri"/>
+                <w:b/>
+                <w:bCs/>
+                <w:color w:val="000000"/>
+                <w:kern w:val="0"/>
+                <w:sz w:val="22"/>
+                <w:szCs w:val="22"/>
+                <w:lang w:eastAsia="en-IN"/>
+                <w14:ligatures w14:val="none"/>
+              </w:rPr>
+            </w:pPr>
+            <w:r>
+              <w:rPr>
+                <w:rFonts w:ascii="Calibri" w:eastAsia="Times New Roman" w:hAnsi="Calibri" w:cs="Calibri"/>
+                <w:b/>
+                <w:bCs/>
+                <w:color w:val="000000"/>
+                <w:kern w:val="0"/>
+                <w:sz w:val="22"/>
+                <w:szCs w:val="22"/>
+                <w:lang w:eastAsia="en-IN"/>
+                <w14:ligatures w14:val="none"/>
+              </w:rPr>
+              <w:t>FONO Supply</w:t>
+            </w:r>
+          </w:p>
+        </w:tc>
+        <w:tc>
+          <w:tcPr>
+            <w:tcW w:w="9140" w:type="dxa"/>
+            <w:tcBorders>
+              <w:top w:val="nil"/>
+              <w:left w:val="nil"/>
+              <w:bottom w:val="single" w:sz="4" w:space="0" w:color="auto"/>
+              <w:right w:val="single" w:sz="4" w:space="0" w:color="auto"/>
+            </w:tcBorders>
+            <w:vAlign w:val="center"/>
+            <w:hideMark/>
+          </w:tcPr>
+          <w:p>
+            <w:pPr>
+              <w:spacing w:after="0" w:line="240" w:lineRule="auto"/>
+              <w:jc w:val="center"/>
+              <w:rPr>
+                <w:rFonts w:ascii="Calibri" w:eastAsia="Times New Roman" w:hAnsi="Calibri" w:cs="Calibri"/>
+                <w:b/>
+                <w:bCs/>
+                <w:color w:val="000000"/>
+                <w:kern w:val="0"/>
+                <w:sz w:val="22"/>
+                <w:szCs w:val="22"/>
+                <w:lang w:eastAsia="en-IN"/>
+                <w14:ligatures w14:val="none"/>
+              </w:rPr>
+            </w:pPr>
+            <w:r>
+              <w:rPr>
+                <w:rFonts w:ascii="Calibri" w:eastAsia="Times New Roman" w:hAnsi="Calibri" w:cs="Calibri"/>
+                <w:b/>
+                <w:bCs/>
+                <w:color w:val="000000"/>
+                <w:kern w:val="0"/>
+                <w:sz w:val="22"/>
+                <w:szCs w:val="22"/>
+                <w:lang w:eastAsia="en-IN"/>
+                <w14:ligatures w14:val="none"/>
+              </w:rPr>
+              <w:t>Srinivasan RG</w:t>
+            </w:r>
+          </w:p>
+        </w:tc>
+        <w:tc>
+          <w:tcPr>
+            <w:tcW w:w="6740" w:type="dxa"/>
+            <w:tcBorders>
+              <w:top w:val="nil"/>
+              <w:left w:val="nil"/>
+              <w:bottom w:val="single" w:sz="4" w:space="0" w:color="auto"/>
+              <w:right w:val="single" w:sz="4" w:space="0" w:color="auto"/>
+            </w:tcBorders>
+            <w:vAlign w:val="center"/>
+            <w:hideMark/>
+          </w:tcPr>
+          <w:p>
+            <w:pPr>
+              <w:spacing w:after="0" w:line="240" w:lineRule="auto"/>
+              <w:jc w:val="center"/>
+              <w:rPr>
+                <w:rFonts w:ascii="Calibri" w:eastAsia="Times New Roman" w:hAnsi="Calibri" w:cs="Calibri"/>
+                <w:color w:val="000000"/>
+                <w:kern w:val="0"/>
+                <w:sz w:val="22"/>
+                <w:szCs w:val="22"/>
+                <w:lang w:eastAsia="en-IN"/>
+                <w14:ligatures w14:val="none"/>
+              </w:rPr>
+            </w:pPr>
+            <w:r>
+              <w:rPr>
+                <w:rFonts w:ascii="Calibri" w:eastAsia="Times New Roman" w:hAnsi="Calibri" w:cs="Calibri"/>
+                <w:color w:val="000000"/>
+                <w:kern w:val="0"/>
+                <w:sz w:val="22"/>
+                <w:szCs w:val="22"/>
+                <w:lang w:eastAsia="en-IN"/>
+                <w14:ligatures w14:val="none"/>
+              </w:rPr>
+              <w:t>Accountable for increasing FONO supply capacity and achieving the business targets for the FONO Supply vertical.</w:t>
+            </w:r>
+          </w:p>
+        </w:tc>
+      </w:tr>
+      <w:tr>
+        <w:trPr>
+          <w:trHeight w:val="576"/>
+        </w:trPr>
+        <w:tc>
+          <w:tcPr>
+            <w:tcW w:w="1860" w:type="dxa"/>
+            <w:tcBorders>
+              <w:top w:val="nil"/>
+              <w:left w:val="single" w:sz="4" w:space="0" w:color="auto"/>
+              <w:bottom w:val="single" w:sz="4" w:space="0" w:color="auto"/>
+              <w:right w:val="single" w:sz="4" w:space="0" w:color="auto"/>
+            </w:tcBorders>
+            <w:vAlign w:val="center"/>
+            <w:hideMark/>
+          </w:tcPr>
+          <w:p>
+            <w:pPr>
+              <w:spacing w:after="0" w:line="240" w:lineRule="auto"/>
+              <w:jc w:val="center"/>
+              <w:rPr>
+                <w:rFonts w:ascii="Calibri" w:eastAsia="Times New Roman" w:hAnsi="Calibri" w:cs="Calibri"/>
+                <w:b/>
+                <w:bCs/>
+                <w:color w:val="000000"/>
+                <w:kern w:val="0"/>
+                <w:sz w:val="22"/>
+                <w:szCs w:val="22"/>
+                <w:lang w:eastAsia="en-IN"/>
+                <w14:ligatures w14:val="none"/>
+              </w:rPr>
+            </w:pPr>
+            <w:r>
+              <w:rPr>
+                <w:rFonts w:ascii="Calibri" w:eastAsia="Times New Roman" w:hAnsi="Calibri" w:cs="Calibri"/>
+                <w:b/>
+                <w:bCs/>
+                <w:color w:val="000000"/>
+                <w:kern w:val="0"/>
+                <w:sz w:val="22"/>
+                <w:szCs w:val="22"/>
+                <w:lang w:eastAsia="en-IN"/>
+                <w14:ligatures w14:val="none"/>
+              </w:rPr>
+              <w:t>SP Demand</w:t>
+            </w:r>
+          </w:p>
+        </w:tc>
+        <w:tc>
+          <w:tcPr>
+            <w:tcW w:w="9140" w:type="dxa"/>
+            <w:tcBorders>
+              <w:top w:val="nil"/>
+              <w:left w:val="nil"/>
+              <w:bottom w:val="single" w:sz="4" w:space="0" w:color="auto"/>
+              <w:right w:val="single" w:sz="4" w:space="0" w:color="auto"/>
+            </w:tcBorders>
+            <w:vAlign w:val="center"/>
+            <w:hideMark/>
+          </w:tcPr>
+          <w:p>
+            <w:pPr>
+              <w:spacing w:after="0" w:line="240" w:lineRule="auto"/>
+              <w:jc w:val="center"/>
+              <w:rPr>
+                <w:rFonts w:ascii="Calibri" w:eastAsia="Times New Roman" w:hAnsi="Calibri" w:cs="Calibri"/>
+                <w:b/>
+                <w:bCs/>
+                <w:color w:val="000000"/>
+                <w:kern w:val="0"/>
+                <w:sz w:val="22"/>
+                <w:szCs w:val="22"/>
+                <w:lang w:eastAsia="en-IN"/>
+                <w14:ligatures w14:val="none"/>
+              </w:rPr>
+            </w:pPr>
+            <w:r>
+              <w:rPr>
+                <w:rFonts w:ascii="Calibri" w:eastAsia="Times New Roman" w:hAnsi="Calibri" w:cs="Calibri"/>
+                <w:b/>
+                <w:bCs/>
+                <w:color w:val="000000"/>
+                <w:kern w:val="0"/>
+                <w:sz w:val="22"/>
+                <w:szCs w:val="22"/>
+                <w:lang w:eastAsia="en-IN"/>
+                <w14:ligatures w14:val="none"/>
+              </w:rPr>
+              <w:t>Rajputana &amp; Deccan:</w:t>
+            </w:r>
+            <w:r>
+              <w:rPr>
+                <w:rFonts w:ascii="Calibri" w:eastAsia="Times New Roman" w:hAnsi="Calibri" w:cs="Calibri"/>
+                <w:color w:val="000000"/>
+                <w:kern w:val="0"/>
+                <w:sz w:val="22"/>
+                <w:szCs w:val="22"/>
+                <w:lang w:eastAsia="en-IN"/>
+                <w14:ligatures w14:val="none"/>
+              </w:rPr>
+              <w:t xml:space="preserve"> Prashant Waghire</w:t>
+            </w:r>
+            <w:r>
+              <w:rPr>
+                <w:rFonts w:ascii="Calibri" w:eastAsia="Times New Roman" w:hAnsi="Calibri" w:cs="Calibri"/>
+                <w:b/>
+                <w:bCs/>
+                <w:color w:val="000000"/>
+                <w:kern w:val="0"/>
+                <w:sz w:val="22"/>
+                <w:szCs w:val="22"/>
+                <w:lang w:eastAsia="en-IN"/>
+                <w14:ligatures w14:val="none"/>
+              </w:rPr>
+              <w:t>Commandal &amp; Wellington:</w:t>
+            </w:r>
+            <w:r>
+              <w:rPr>
+                <w:rFonts w:ascii="Calibri" w:eastAsia="Times New Roman" w:hAnsi="Calibri" w:cs="Calibri"/>
+                <w:color w:val="000000"/>
+                <w:kern w:val="0"/>
+                <w:sz w:val="22"/>
+                <w:szCs w:val="22"/>
+                <w:lang w:eastAsia="en-IN"/>
+                <w14:ligatures w14:val="none"/>
+              </w:rPr>
+              <w:t xml:space="preserve"> Satish Sanghey</w:t>
+            </w:r>
+          </w:p>
+        </w:tc>
+        <w:tc>
+          <w:tcPr>
+            <w:tcW w:w="6740" w:type="dxa"/>
+            <w:tcBorders>
+              <w:top w:val="nil"/>
+              <w:left w:val="nil"/>
+              <w:bottom w:val="single" w:sz="4" w:space="0" w:color="auto"/>
+              <w:right w:val="single" w:sz="4" w:space="0" w:color="auto"/>
+            </w:tcBorders>
+            <w:vAlign w:val="center"/>
+            <w:hideMark/>
+          </w:tcPr>
+          <w:p>
+            <w:pPr>
+              <w:spacing w:after="0" w:line="240" w:lineRule="auto"/>
+              <w:jc w:val="center"/>
+              <w:rPr>
+                <w:rFonts w:ascii="Calibri" w:eastAsia="Times New Roman" w:hAnsi="Calibri" w:cs="Calibri"/>
+                <w:color w:val="000000"/>
+                <w:kern w:val="0"/>
+                <w:sz w:val="22"/>
+                <w:szCs w:val="22"/>
+                <w:lang w:eastAsia="en-IN"/>
+                <w14:ligatures w14:val="none"/>
+              </w:rPr>
+            </w:pPr>
+            <w:r>
+              <w:rPr>
+                <w:rFonts w:ascii="Calibri" w:eastAsia="Times New Roman" w:hAnsi="Calibri" w:cs="Calibri"/>
+                <w:color w:val="000000"/>
+                <w:kern w:val="0"/>
+                <w:sz w:val="22"/>
+                <w:szCs w:val="22"/>
+                <w:lang w:eastAsia="en-IN"/>
+                <w14:ligatures w14:val="none"/>
+              </w:rPr>
+              <w:t>Accountable for driving demand growth and achieving Shram Park demand targets for their respective theatres.</w:t>
+            </w:r>
+          </w:p>
+        </w:tc>
+      </w:tr>
+      <w:tr>
+        <w:trPr>
+          <w:trHeight w:val="576"/>
+        </w:trPr>
+        <w:tc>
+          <w:tcPr>
+            <w:tcW w:w="1860" w:type="dxa"/>
+            <w:tcBorders>
+              <w:top w:val="nil"/>
+              <w:left w:val="single" w:sz="4" w:space="0" w:color="auto"/>
+              <w:bottom w:val="single" w:sz="4" w:space="0" w:color="auto"/>
+              <w:right w:val="single" w:sz="4" w:space="0" w:color="auto"/>
+            </w:tcBorders>
+            <w:vAlign w:val="center"/>
+            <w:hideMark/>
+          </w:tcPr>
+          <w:p>
+            <w:pPr>
+              <w:spacing w:after="0" w:line="240" w:lineRule="auto"/>
+              <w:jc w:val="center"/>
+              <w:rPr>
+                <w:rFonts w:ascii="Calibri" w:eastAsia="Times New Roman" w:hAnsi="Calibri" w:cs="Calibri"/>
+                <w:b/>
+                <w:bCs/>
+                <w:color w:val="000000"/>
+                <w:kern w:val="0"/>
+                <w:sz w:val="22"/>
+                <w:szCs w:val="22"/>
+                <w:lang w:eastAsia="en-IN"/>
+                <w14:ligatures w14:val="none"/>
+              </w:rPr>
+            </w:pPr>
+            <w:r>
+              <w:rPr>
+                <w:rFonts w:ascii="Calibri" w:eastAsia="Times New Roman" w:hAnsi="Calibri" w:cs="Calibri"/>
+                <w:b/>
+                <w:bCs/>
+                <w:color w:val="000000"/>
+                <w:kern w:val="0"/>
+                <w:sz w:val="22"/>
+                <w:szCs w:val="22"/>
+                <w:lang w:eastAsia="en-IN"/>
+                <w14:ligatures w14:val="none"/>
+              </w:rPr>
+              <w:lastRenderedPageBreak/>
+              <w:t>SP Supply</w:t>
+            </w:r>
+          </w:p>
+        </w:tc>
+        <w:tc>
+          <w:tcPr>
+            <w:tcW w:w="9140" w:type="dxa"/>
+            <w:tcBorders>
+              <w:top w:val="nil"/>
+              <w:left w:val="nil"/>
+              <w:bottom w:val="single" w:sz="4" w:space="0" w:color="auto"/>
+              <w:right w:val="single" w:sz="4" w:space="0" w:color="auto"/>
+            </w:tcBorders>
+            <w:vAlign w:val="center"/>
+            <w:hideMark/>
+          </w:tcPr>
+          <w:p>
+            <w:pPr>
+              <w:spacing w:after="0" w:line="240" w:lineRule="auto"/>
+              <w:jc w:val="center"/>
+              <w:rPr>
+                <w:rFonts w:ascii="Calibri" w:eastAsia="Times New Roman" w:hAnsi="Calibri" w:cs="Calibri"/>
+                <w:b/>
+                <w:bCs/>
+                <w:color w:val="000000"/>
+                <w:kern w:val="0"/>
+                <w:sz w:val="22"/>
+                <w:szCs w:val="22"/>
+                <w:lang w:eastAsia="en-IN"/>
+                <w14:ligatures w14:val="none"/>
+              </w:rPr>
+            </w:pPr>
+            <w:r>
+              <w:rPr>
+                <w:rFonts w:ascii="Calibri" w:eastAsia="Times New Roman" w:hAnsi="Calibri" w:cs="Calibri"/>
+                <w:b/>
+                <w:bCs/>
+                <w:color w:val="000000"/>
+                <w:kern w:val="0"/>
+                <w:sz w:val="22"/>
+                <w:szCs w:val="22"/>
+                <w:lang w:eastAsia="en-IN"/>
+                <w14:ligatures w14:val="none"/>
+              </w:rPr>
+              <w:t>Rajputana &amp; Deccan:</w:t>
+            </w:r>
+            <w:r>
+              <w:rPr>
+                <w:rFonts w:ascii="Calibri" w:eastAsia="Times New Roman" w:hAnsi="Calibri" w:cs="Calibri"/>
+                <w:color w:val="000000"/>
+                <w:kern w:val="0"/>
+                <w:sz w:val="22"/>
+                <w:szCs w:val="22"/>
+                <w:lang w:eastAsia="en-IN"/>
+                <w14:ligatures w14:val="none"/>
+              </w:rPr>
+              <w:t xml:space="preserve"> Prashant Waghire</w:t>
+            </w:r>
+            <w:r>
+              <w:rPr>
+                <w:rFonts w:ascii="Calibri" w:eastAsia="Times New Roman" w:hAnsi="Calibri" w:cs="Calibri"/>
+                <w:b/>
+                <w:bCs/>
+                <w:color w:val="000000"/>
+                <w:kern w:val="0"/>
+                <w:sz w:val="22"/>
+                <w:szCs w:val="22"/>
+                <w:lang w:eastAsia="en-IN"/>
+                <w14:ligatures w14:val="none"/>
+              </w:rPr>
+              <w:t>Commandal &amp; Wellington:</w:t>
+            </w:r>
+            <w:r>
+              <w:rPr>
+                <w:rFonts w:ascii="Calibri" w:eastAsia="Times New Roman" w:hAnsi="Calibri" w:cs="Calibri"/>
+                <w:color w:val="000000"/>
+                <w:kern w:val="0"/>
+                <w:sz w:val="22"/>
+                <w:szCs w:val="22"/>
+                <w:lang w:eastAsia="en-IN"/>
+                <w14:ligatures w14:val="none"/>
+              </w:rPr>
+              <w:t xml:space="preserve"> Satish Sanghey</w:t>
+            </w:r>
+          </w:p>
+        </w:tc>
+        <w:tc>
+          <w:tcPr>
+            <w:tcW w:w="6740" w:type="dxa"/>
+            <w:tcBorders>
+              <w:top w:val="nil"/>
+              <w:left w:val="nil"/>
+              <w:bottom w:val="single" w:sz="4" w:space="0" w:color="auto"/>
+              <w:right w:val="single" w:sz="4" w:space="0" w:color="auto"/>
+            </w:tcBorders>
+            <w:vAlign w:val="center"/>
+            <w:hideMark/>
+          </w:tcPr>
+          <w:p>
+            <w:pPr>
+              <w:spacing w:after="0" w:line="240" w:lineRule="auto"/>
+              <w:jc w:val="center"/>
+              <w:rPr>
+                <w:rFonts w:ascii="Calibri" w:eastAsia="Times New Roman" w:hAnsi="Calibri" w:cs="Calibri"/>
+                <w:color w:val="000000"/>
+                <w:kern w:val="0"/>
+                <w:sz w:val="22"/>
+                <w:szCs w:val="22"/>
+                <w:lang w:eastAsia="en-IN"/>
+                <w14:ligatures w14:val="none"/>
+              </w:rPr>
+            </w:pPr>
+            <w:r>
+              <w:rPr>
+                <w:rFonts w:ascii="Calibri" w:eastAsia="Times New Roman" w:hAnsi="Calibri" w:cs="Calibri"/>
+                <w:color w:val="000000"/>
+                <w:kern w:val="0"/>
+                <w:sz w:val="22"/>
+                <w:szCs w:val="22"/>
+                <w:lang w:eastAsia="en-IN"/>
+                <w14:ligatures w14:val="none"/>
+              </w:rPr>
+              <w:t>Accountable for increasing supply and achieving Shram Park supply targets for their respective theatres.</w:t>
+            </w:r>
+          </w:p>
+        </w:tc>
+      </w:tr>
+      <w:tr>
+        <w:trPr>
+          <w:trHeight w:val="576"/>
+        </w:trPr>
+        <w:tc>
+          <w:tcPr>
+            <w:tcW w:w="1860" w:type="dxa"/>
+            <w:tcBorders>
+              <w:top w:val="nil"/>
+              <w:left w:val="single" w:sz="4" w:space="0" w:color="auto"/>
+              <w:bottom w:val="single" w:sz="4" w:space="0" w:color="auto"/>
+              <w:right w:val="single" w:sz="4" w:space="0" w:color="auto"/>
+            </w:tcBorders>
+            <w:vAlign w:val="center"/>
+            <w:hideMark/>
+          </w:tcPr>
+          <w:p>
+            <w:pPr>
+              <w:spacing w:after="0" w:line="240" w:lineRule="auto"/>
+              <w:jc w:val="center"/>
+              <w:rPr>
+                <w:rFonts w:ascii="Calibri" w:eastAsia="Times New Roman" w:hAnsi="Calibri" w:cs="Calibri"/>
+                <w:b/>
+                <w:bCs/>
+                <w:color w:val="000000"/>
+                <w:kern w:val="0"/>
+                <w:sz w:val="22"/>
+                <w:szCs w:val="22"/>
+                <w:lang w:eastAsia="en-IN"/>
+                <w14:ligatures w14:val="none"/>
+              </w:rPr>
+            </w:pPr>
+            <w:r>
+              <w:rPr>
+                <w:rFonts w:ascii="Calibri" w:eastAsia="Times New Roman" w:hAnsi="Calibri" w:cs="Calibri"/>
+                <w:b/>
+                <w:bCs/>
+                <w:color w:val="000000"/>
+                <w:kern w:val="0"/>
+                <w:sz w:val="22"/>
+                <w:szCs w:val="22"/>
+                <w:lang w:eastAsia="en-IN"/>
+                <w14:ligatures w14:val="none"/>
+              </w:rPr>
+              <w:t>Enterprise Demand</w:t>
+            </w:r>
+          </w:p>
+        </w:tc>
+        <w:tc>
+          <w:tcPr>
+            <w:tcW w:w="9140" w:type="dxa"/>
+            <w:tcBorders>
+              <w:top w:val="nil"/>
+              <w:left w:val="nil"/>
+              <w:bottom w:val="single" w:sz="4" w:space="0" w:color="auto"/>
+              <w:right w:val="single" w:sz="4" w:space="0" w:color="auto"/>
+            </w:tcBorders>
+            <w:vAlign w:val="center"/>
+            <w:hideMark/>
+          </w:tcPr>
+          <w:p>
+            <w:pPr>
+              <w:spacing w:after="0" w:line="240" w:lineRule="auto"/>
+              <w:jc w:val="center"/>
+              <w:rPr>
+                <w:rFonts w:ascii="Calibri" w:eastAsia="Times New Roman" w:hAnsi="Calibri" w:cs="Calibri"/>
+                <w:b/>
+                <w:bCs/>
+                <w:color w:val="000000"/>
+                <w:kern w:val="0"/>
+                <w:sz w:val="22"/>
+                <w:szCs w:val="22"/>
+                <w:lang w:eastAsia="en-IN"/>
+                <w14:ligatures w14:val="none"/>
+              </w:rPr>
+            </w:pPr>
+            <w:r>
+              <w:rPr>
+                <w:rFonts w:ascii="Calibri" w:eastAsia="Times New Roman" w:hAnsi="Calibri" w:cs="Calibri"/>
+                <w:b/>
+                <w:bCs/>
+                <w:color w:val="000000"/>
+                <w:kern w:val="0"/>
+                <w:sz w:val="22"/>
+                <w:szCs w:val="22"/>
+                <w:lang w:eastAsia="en-IN"/>
+                <w14:ligatures w14:val="none"/>
+              </w:rPr>
+              <w:t>Srinivasan RG</w:t>
+            </w:r>
+          </w:p>
+        </w:tc>
+        <w:tc>
+          <w:tcPr>
+            <w:tcW w:w="6740" w:type="dxa"/>
+            <w:tcBorders>
+              <w:top w:val="nil"/>
+              <w:left w:val="nil"/>
+              <w:bottom w:val="single" w:sz="4" w:space="0" w:color="auto"/>
+              <w:right w:val="single" w:sz="4" w:space="0" w:color="auto"/>
+            </w:tcBorders>
+            <w:vAlign w:val="center"/>
+            <w:hideMark/>
+          </w:tcPr>
+          <w:p>
+            <w:pPr>
+              <w:spacing w:after="0" w:line="240" w:lineRule="auto"/>
+              <w:jc w:val="center"/>
+              <w:rPr>
+                <w:rFonts w:ascii="Calibri" w:eastAsia="Times New Roman" w:hAnsi="Calibri" w:cs="Calibri"/>
+                <w:color w:val="000000"/>
+                <w:kern w:val="0"/>
+                <w:sz w:val="22"/>
+                <w:szCs w:val="22"/>
+                <w:lang w:eastAsia="en-IN"/>
+                <w14:ligatures w14:val="none"/>
+              </w:rPr>
+            </w:pPr>
+            <w:r>
+              <w:rPr>
+                <w:rFonts w:ascii="Calibri" w:eastAsia="Times New Roman" w:hAnsi="Calibri" w:cs="Calibri"/>
+                <w:color w:val="000000"/>
+                <w:kern w:val="0"/>
+                <w:sz w:val="22"/>
+                <w:szCs w:val="22"/>
+                <w:lang w:eastAsia="en-IN"/>
+                <w14:ligatures w14:val="none"/>
+              </w:rPr>
+              <w:t>Accountable for driving enterprise demand generation and achieving business targets for the Enterprise Demand vertical.</w:t>
+            </w:r>
+          </w:p>
+        </w:tc>
+      </w:tr>
+      <w:tr>
+        <w:trPr>
+          <w:trHeight w:val="576"/>
+        </w:trPr>
+        <w:tc>
+          <w:tcPr>
+            <w:tcW w:w="1860" w:type="dxa"/>
+            <w:tcBorders>
+              <w:top w:val="nil"/>
+              <w:left w:val="single" w:sz="4" w:space="0" w:color="auto"/>
+              <w:bottom w:val="single" w:sz="4" w:space="0" w:color="auto"/>
+              <w:right w:val="single" w:sz="4" w:space="0" w:color="auto"/>
+            </w:tcBorders>
+            <w:vAlign w:val="center"/>
+            <w:hideMark/>
+          </w:tcPr>
+          <w:p>
+            <w:pPr>
+              <w:spacing w:after="0" w:line="240" w:lineRule="auto"/>
+              <w:jc w:val="center"/>
+              <w:rPr>
+                <w:rFonts w:ascii="Calibri" w:eastAsia="Times New Roman" w:hAnsi="Calibri" w:cs="Calibri"/>
+                <w:b/>
+                <w:bCs/>
+                <w:color w:val="000000"/>
+                <w:kern w:val="0"/>
+                <w:sz w:val="22"/>
+                <w:szCs w:val="22"/>
+                <w:lang w:eastAsia="en-IN"/>
+                <w14:ligatures w14:val="none"/>
+              </w:rPr>
+            </w:pPr>
+            <w:r>
+              <w:rPr>
+                <w:rFonts w:ascii="Calibri" w:eastAsia="Times New Roman" w:hAnsi="Calibri" w:cs="Calibri"/>
+                <w:b/>
+                <w:bCs/>
+                <w:color w:val="000000"/>
+                <w:kern w:val="0"/>
+                <w:sz w:val="22"/>
+                <w:szCs w:val="22"/>
+                <w:lang w:eastAsia="en-IN"/>
+                <w14:ligatures w14:val="none"/>
+              </w:rPr>
+              <w:t>Enterprise Supply</w:t>
+            </w:r>
+          </w:p>
+        </w:tc>
+        <w:tc>
+          <w:tcPr>
+            <w:tcW w:w="9140" w:type="dxa"/>
+            <w:tcBorders>
+              <w:top w:val="nil"/>
+              <w:left w:val="nil"/>
+              <w:bottom w:val="single" w:sz="4" w:space="0" w:color="auto"/>
+              <w:right w:val="single" w:sz="4" w:space="0" w:color="auto"/>
+            </w:tcBorders>
+            <w:vAlign w:val="center"/>
+            <w:hideMark/>
+          </w:tcPr>
+          <w:p>
+            <w:pPr>
+              <w:spacing w:after="0" w:line="240" w:lineRule="auto"/>
+              <w:jc w:val="center"/>
+              <w:rPr>
+                <w:rFonts w:ascii="Calibri" w:eastAsia="Times New Roman" w:hAnsi="Calibri" w:cs="Calibri"/>
+                <w:b/>
+                <w:bCs/>
+                <w:color w:val="000000"/>
+                <w:kern w:val="0"/>
+                <w:sz w:val="22"/>
+                <w:szCs w:val="22"/>
+                <w:lang w:eastAsia="en-IN"/>
+                <w14:ligatures w14:val="none"/>
+              </w:rPr>
+            </w:pPr>
+            <w:r>
+              <w:rPr>
+                <w:rFonts w:ascii="Calibri" w:eastAsia="Times New Roman" w:hAnsi="Calibri" w:cs="Calibri"/>
+                <w:b/>
+                <w:bCs/>
+                <w:color w:val="000000"/>
+                <w:kern w:val="0"/>
+                <w:sz w:val="22"/>
+                <w:szCs w:val="22"/>
+                <w:lang w:eastAsia="en-IN"/>
+                <w14:ligatures w14:val="none"/>
+              </w:rPr>
+              <w:t>Srinivasan RG</w:t>
+            </w:r>
+          </w:p>
+        </w:tc>
+        <w:tc>
+          <w:tcPr>
+            <w:tcW w:w="6740" w:type="dxa"/>
+            <w:tcBorders>
+              <w:top w:val="nil"/>
+              <w:left w:val="nil"/>
+              <w:bottom w:val="single" w:sz="4" w:space="0" w:color="auto"/>
+              <w:right w:val="single" w:sz="4" w:space="0" w:color="auto"/>
+            </w:tcBorders>
+            <w:vAlign w:val="center"/>
+            <w:hideMark/>
+          </w:tcPr>
+          <w:p>
+            <w:pPr>
+              <w:spacing w:after="0" w:line="240" w:lineRule="auto"/>
+              <w:jc w:val="center"/>
+              <w:rPr>
+                <w:rFonts w:ascii="Calibri" w:eastAsia="Times New Roman" w:hAnsi="Calibri" w:cs="Calibri"/>
+                <w:color w:val="000000"/>
+                <w:kern w:val="0"/>
+                <w:sz w:val="22"/>
+                <w:szCs w:val="22"/>
+                <w:lang w:eastAsia="en-IN"/>
+                <w14:ligatures w14:val="none"/>
+              </w:rPr>
+            </w:pPr>
+            <w:r>
+              <w:rPr>
+                <w:rFonts w:ascii="Calibri" w:eastAsia="Times New Roman" w:hAnsi="Calibri" w:cs="Calibri"/>
+                <w:color w:val="000000"/>
+                <w:kern w:val="0"/>
+                <w:sz w:val="22"/>
+                <w:szCs w:val="22"/>
+                <w:lang w:eastAsia="en-IN"/>
+                <w14:ligatures w14:val="none"/>
+              </w:rPr>
+              <w:t>Accountable for expanding enterprise supply capacity and achieving business targets for the Enterprise Supply vertical.</w:t>
+            </w:r>
+          </w:p>
+        </w:tc>
+      </w:tr>
+      <w:tr>
+        <w:trPr>
+          <w:trHeight w:val="576"/>
+        </w:trPr>
+        <w:tc>
+          <w:tcPr>
+            <w:tcW w:w="1860" w:type="dxa"/>
+            <w:tcBorders>
+              <w:top w:val="nil"/>
+              <w:left w:val="single" w:sz="4" w:space="0" w:color="auto"/>
+              <w:bottom w:val="single" w:sz="4" w:space="0" w:color="auto"/>
+              <w:right w:val="single" w:sz="4" w:space="0" w:color="auto"/>
+            </w:tcBorders>
+            <w:vAlign w:val="center"/>
+            <w:hideMark/>
+          </w:tcPr>
+          <w:p>
+            <w:pPr>
+              <w:spacing w:after="0" w:line="240" w:lineRule="auto"/>
+              <w:jc w:val="center"/>
+              <w:rPr>
+                <w:rFonts w:ascii="Calibri" w:eastAsia="Times New Roman" w:hAnsi="Calibri" w:cs="Calibri"/>
+                <w:b/>
+                <w:bCs/>
+                <w:color w:val="000000"/>
+                <w:kern w:val="0"/>
+                <w:sz w:val="22"/>
+                <w:szCs w:val="22"/>
+                <w:lang w:eastAsia="en-IN"/>
+                <w14:ligatures w14:val="none"/>
+              </w:rPr>
+            </w:pPr>
+            <w:r>
+              <w:rPr>
+                <w:rFonts w:ascii="Calibri" w:eastAsia="Times New Roman" w:hAnsi="Calibri" w:cs="Calibri"/>
+                <w:b/>
+                <w:bCs/>
+                <w:color w:val="000000"/>
+                <w:kern w:val="0"/>
+                <w:sz w:val="22"/>
+                <w:szCs w:val="22"/>
+                <w:lang w:eastAsia="en-IN"/>
+                <w14:ligatures w14:val="none"/>
+              </w:rPr>
+              <w:t>Finance</w:t>
+            </w:r>
+          </w:p>
+        </w:tc>
+        <w:tc>
+          <w:tcPr>
+            <w:tcW w:w="9140" w:type="dxa"/>
+            <w:tcBorders>
+              <w:top w:val="nil"/>
+              <w:left w:val="nil"/>
+              <w:bottom w:val="single" w:sz="4" w:space="0" w:color="auto"/>
+              <w:right w:val="single" w:sz="4" w:space="0" w:color="auto"/>
+            </w:tcBorders>
+            <w:vAlign w:val="center"/>
+            <w:hideMark/>
+          </w:tcPr>
+          <w:p>
+            <w:pPr>
+              <w:spacing w:after="0" w:line="240" w:lineRule="auto"/>
+              <w:jc w:val="center"/>
+              <w:rPr>
+                <w:rFonts w:ascii="Calibri" w:eastAsia="Times New Roman" w:hAnsi="Calibri" w:cs="Calibri"/>
+                <w:b/>
+                <w:bCs/>
+                <w:color w:val="000000"/>
+                <w:kern w:val="0"/>
+                <w:sz w:val="22"/>
+                <w:szCs w:val="22"/>
+                <w:lang w:eastAsia="en-IN"/>
+                <w14:ligatures w14:val="none"/>
+              </w:rPr>
+            </w:pPr>
+            <w:r>
+              <w:rPr>
+                <w:rFonts w:ascii="Calibri" w:eastAsia="Times New Roman" w:hAnsi="Calibri" w:cs="Calibri"/>
+                <w:b/>
+                <w:bCs/>
+                <w:color w:val="000000"/>
+                <w:kern w:val="0"/>
+                <w:sz w:val="22"/>
+                <w:szCs w:val="22"/>
+                <w:lang w:eastAsia="en-IN"/>
+                <w14:ligatures w14:val="none"/>
+              </w:rPr>
+              <w:t>Owner:</w:t>
+            </w:r>
+            <w:r>
+              <w:rPr>
+                <w:rFonts w:ascii="Calibri" w:eastAsia="Times New Roman" w:hAnsi="Calibri" w:cs="Calibri"/>
+                <w:color w:val="000000"/>
+                <w:kern w:val="0"/>
+                <w:sz w:val="22"/>
+                <w:szCs w:val="22"/>
+                <w:lang w:eastAsia="en-IN"/>
+                <w14:ligatures w14:val="none"/>
+              </w:rPr>
+              <w:t xml:space="preserve"> Shrey</w:t>
+            </w:r>
+            <w:r>
+              <w:rPr>
+                <w:rFonts w:ascii="Calibri" w:eastAsia="Times New Roman" w:hAnsi="Calibri" w:cs="Calibri"/>
+                <w:b/>
+                <w:bCs/>
+                <w:color w:val="000000"/>
+                <w:kern w:val="0"/>
+                <w:sz w:val="22"/>
+                <w:szCs w:val="22"/>
+                <w:lang w:eastAsia="en-IN"/>
+                <w14:ligatures w14:val="none"/>
+              </w:rPr>
+              <w:t>Approver &amp; Recipient:</w:t>
+            </w:r>
+            <w:r>
+              <w:rPr>
+                <w:rFonts w:ascii="Calibri" w:eastAsia="Times New Roman" w:hAnsi="Calibri" w:cs="Calibri"/>
+                <w:color w:val="000000"/>
+                <w:kern w:val="0"/>
+                <w:sz w:val="22"/>
+                <w:szCs w:val="22"/>
+                <w:lang w:eastAsia="en-IN"/>
+                <w14:ligatures w14:val="none"/>
+              </w:rPr>
+              <w:t xml:space="preserve"> Yoshit</w:t>
+            </w:r>
+          </w:p>
+        </w:tc>
+        <w:tc>
+          <w:tcPr>
+            <w:tcW w:w="6740" w:type="dxa"/>
+            <w:tcBorders>
+              <w:top w:val="nil"/>
+              <w:left w:val="nil"/>
+              <w:bottom w:val="single" w:sz="4" w:space="0" w:color="auto"/>
+              <w:right w:val="single" w:sz="4" w:space="0" w:color="auto"/>
+            </w:tcBorders>
+            <w:vAlign w:val="center"/>
+            <w:hideMark/>
+          </w:tcPr>
+          <w:p>
+            <w:pPr>
+              <w:spacing w:after="0" w:line="240" w:lineRule="auto"/>
+              <w:jc w:val="center"/>
+              <w:rPr>
+                <w:rFonts w:ascii="Calibri" w:eastAsia="Times New Roman" w:hAnsi="Calibri" w:cs="Calibri"/>
+                <w:color w:val="000000"/>
+                <w:kern w:val="0"/>
+                <w:sz w:val="22"/>
+                <w:szCs w:val="22"/>
+                <w:lang w:eastAsia="en-IN"/>
+                <w14:ligatures w14:val="none"/>
+              </w:rPr>
+            </w:pPr>
+            <w:r>
+              <w:rPr>
+                <w:rFonts w:ascii="Calibri" w:eastAsia="Times New Roman" w:hAnsi="Calibri" w:cs="Calibri"/>
+                <w:color w:val="000000"/>
+                <w:kern w:val="0"/>
+                <w:sz w:val="22"/>
+                <w:szCs w:val="22"/>
+                <w:lang w:eastAsia="en-IN"/>
+                <w14:ligatures w14:val="none"/>
+              </w:rPr>
+              <w:t>Accountable for financial governance, budget ownership, approvals, and ensuring financial targets and controls are achieved.</w:t>
+            </w:r>
+          </w:p>
+        </w:tc>
+      </w:tr>
+      <w:tr>
+        <w:trPr>
+          <w:trHeight w:val="576"/>
+        </w:trPr>
+        <w:tc>
+          <w:tcPr>
+            <w:tcW w:w="1860" w:type="dxa"/>
+            <w:tcBorders>
+              <w:top w:val="nil"/>
+              <w:left w:val="single" w:sz="4" w:space="0" w:color="auto"/>
+              <w:bottom w:val="single" w:sz="4" w:space="0" w:color="auto"/>
+              <w:right w:val="single" w:sz="4" w:space="0" w:color="auto"/>
+            </w:tcBorders>
+            <w:vAlign w:val="center"/>
+            <w:hideMark/>
+          </w:tcPr>
+          <w:p>
+            <w:pPr>
+              <w:spacing w:after="0" w:line="240" w:lineRule="auto"/>
+              <w:jc w:val="center"/>
+              <w:rPr>
+                <w:rFonts w:ascii="Calibri" w:eastAsia="Times New Roman" w:hAnsi="Calibri" w:cs="Calibri"/>
+                <w:b/>
+                <w:bCs/>
+                <w:color w:val="000000"/>
+                <w:kern w:val="0"/>
+                <w:sz w:val="22"/>
+                <w:szCs w:val="22"/>
+                <w:lang w:eastAsia="en-IN"/>
+                <w14:ligatures w14:val="none"/>
+              </w:rPr>
+            </w:pPr>
+            <w:r>
+              <w:rPr>
+                <w:rFonts w:ascii="Calibri" w:eastAsia="Times New Roman" w:hAnsi="Calibri" w:cs="Calibri"/>
+                <w:b/>
+                <w:bCs/>
+                <w:color w:val="000000"/>
+                <w:kern w:val="0"/>
+                <w:sz w:val="22"/>
+                <w:szCs w:val="22"/>
+                <w:lang w:eastAsia="en-IN"/>
+                <w14:ligatures w14:val="none"/>
+              </w:rPr>
+              <w:t>Collection</w:t>
+            </w:r>
+          </w:p>
+        </w:tc>
+        <w:tc>
+          <w:tcPr>
+            <w:tcW w:w="9140" w:type="dxa"/>
+            <w:tcBorders>
+              <w:top w:val="nil"/>
+              <w:left w:val="nil"/>
+              <w:bottom w:val="single" w:sz="4" w:space="0" w:color="auto"/>
+              <w:right w:val="single" w:sz="4" w:space="0" w:color="auto"/>
+            </w:tcBorders>
+            <w:vAlign w:val="center"/>
+            <w:hideMark/>
+          </w:tcPr>
+          <w:p>
+            <w:pPr>
+              <w:spacing w:after="0" w:line="240" w:lineRule="auto"/>
+              <w:jc w:val="center"/>
+              <w:rPr>
+                <w:rFonts w:ascii="Calibri" w:eastAsia="Times New Roman" w:hAnsi="Calibri" w:cs="Calibri"/>
+                <w:b/>
+                <w:bCs/>
+                <w:color w:val="000000"/>
+                <w:kern w:val="0"/>
+                <w:sz w:val="22"/>
+                <w:szCs w:val="22"/>
+                <w:lang w:eastAsia="en-IN"/>
+                <w14:ligatures w14:val="none"/>
+              </w:rPr>
+            </w:pPr>
+            <w:r>
+              <w:rPr>
+                <w:rFonts w:ascii="Calibri" w:eastAsia="Times New Roman" w:hAnsi="Calibri" w:cs="Calibri"/>
+                <w:b/>
+                <w:bCs/>
+                <w:color w:val="000000"/>
+                <w:kern w:val="0"/>
+                <w:sz w:val="22"/>
+                <w:szCs w:val="22"/>
+                <w:lang w:eastAsia="en-IN"/>
+                <w14:ligatures w14:val="none"/>
+              </w:rPr>
+              <w:t>Local Theatre TeamsFinance:</w:t>
+            </w:r>
+            <w:r>
+              <w:rPr>
+                <w:rFonts w:ascii="Calibri" w:eastAsia="Times New Roman" w:hAnsi="Calibri" w:cs="Calibri"/>
+                <w:color w:val="000000"/>
+                <w:kern w:val="0"/>
+                <w:sz w:val="22"/>
+                <w:szCs w:val="22"/>
+                <w:lang w:eastAsia="en-IN"/>
+                <w14:ligatures w14:val="none"/>
+              </w:rPr>
+              <w:t xml:space="preserve"> Bidhyadhar Nayak</w:t>
+            </w:r>
+          </w:p>
+        </w:tc>
+        <w:tc>
+          <w:tcPr>
+            <w:tcW w:w="6740" w:type="dxa"/>
+            <w:tcBorders>
+              <w:top w:val="nil"/>
+              <w:left w:val="nil"/>
+              <w:bottom w:val="single" w:sz="4" w:space="0" w:color="auto"/>
+              <w:right w:val="single" w:sz="4" w:space="0" w:color="auto"/>
+            </w:tcBorders>
+            <w:vAlign w:val="center"/>
+            <w:hideMark/>
+          </w:tcPr>
+          <w:p>
+            <w:pPr>
+              <w:spacing w:after="0" w:line="240" w:lineRule="auto"/>
+              <w:jc w:val="center"/>
+              <w:rPr>
+                <w:rFonts w:ascii="Calibri" w:eastAsia="Times New Roman" w:hAnsi="Calibri" w:cs="Calibri"/>
+                <w:color w:val="000000"/>
+                <w:kern w:val="0"/>
+                <w:sz w:val="22"/>
+                <w:szCs w:val="22"/>
+                <w:lang w:eastAsia="en-IN"/>
+                <w14:ligatures w14:val="none"/>
+              </w:rPr>
+            </w:pPr>
+            <w:r>
+              <w:rPr>
+                <w:rFonts w:ascii="Calibri" w:eastAsia="Times New Roman" w:hAnsi="Calibri" w:cs="Calibri"/>
+                <w:color w:val="000000"/>
+                <w:kern w:val="0"/>
+                <w:sz w:val="22"/>
+                <w:szCs w:val="22"/>
+                <w:lang w:eastAsia="en-IN"/>
+                <w14:ligatures w14:val="none"/>
+              </w:rPr>
+              <w:t>Accountable for maximizing collections, reducing outstanding dues, and achieving collection targets across all theatres.</w:t>
+            </w:r>
+          </w:p>
+        </w:tc>
+      </w:tr>
+    </w:tbl>
+    <w:p/>
+    <w:p/>
+    <w:p/>
     <w:sectPr>
       <w:pgSz w:w="11906" w:h="16838"/>
       <w:pgMar w:top="1440" w:right="1440" w:bottom="1440" w:left="1440" w:header="708" w:footer="708" w:gutter="0"/>
@@ -1050,7 +2628,7 @@
 </file>
 
 <file path=word/numbering.xml><?xml version="1.0" encoding="utf-8"?>
-<w:numbering xmlns:wpc="http://schemas.microsoft.com/office/word/2010/wordprocessingCanvas" xmlns:cx="http://schemas.microsoft.com/office/drawing/2014/chartex" xmlns:cx1="http://schemas.microsoft.com/office/drawing/2015/9/8/chartex" xmlns:cx2="http://schemas.microsoft.com/office/drawing/2015/10/21/chartex" xmlns:cx3="http://schemas.microsoft.com/office/drawing/2016/5/9/chartex" xmlns:cx4="http://schemas.microsoft.com/office/drawing/2016/5/10/chartex" xmlns:cx5="http://schemas.microsoft.com/office/drawing/2016/5/11/chartex" xmlns:cx6="http://schemas.microsoft.com/office/drawing/2016/5/12/chartex" xmlns:cx7="http://schemas.microsoft.com/office/drawing/2016/5/13/chartex" xmlns:cx8="http://schemas.microsoft.com/office/drawing/2016/5/14/chartex" xmlns:mc="http://schemas.openxmlformats.org/markup-compatibility/2006" xmlns:aink="http://schemas.microsoft.com/office/drawing/2016/ink" xmlns:am3d="http://schemas.microsoft.com/office/drawing/2017/model3d" xmlns:o="urn:schemas-microsoft-com:office:office" xmlns:oel="http://schemas.microsoft.com/office/2019/extlst" xmlns:r="http://schemas.openxmlformats.org/officeDocument/2006/relationships" xmlns:m="http://schemas.openxmlformats.org/officeDocument/2006/math" xmlns:v="urn:schemas-microsoft-com:vml" xmlns:wp14="http://schemas.microsoft.com/office/word/2010/wordprocessingDrawing" xmlns:wp="http://schemas.openxmlformats.org/drawingml/2006/wordprocessingDrawing" xmlns:w10="urn:schemas-microsoft-com:office:word" xmlns:w="http://schemas.openxmlformats.org/wordprocessingml/2006/main" xmlns:w14="http://schemas.microsoft.com/office/word/2010/wordml" xmlns:w15="http://schemas.microsoft.com/office/word/2012/wordml" xmlns:w16cex="http://schemas.microsoft.com/office/word/2018/wordml/cex" xmlns:w16cid="http://schemas.microsoft.com/office/word/2016/wordml/cid" xmlns:w16="http://schemas.microsoft.com/office/word/2018/wordml" xmlns:w16du="http://schemas.microsoft.com/office/word/2023/wordml/word16du" xmlns:w16sdtdh="http://schemas.microsoft.com/office/word/2020/wordml/sdtdatahash" xmlns:w16sdtfl="http://schemas.microsoft.com/office/word/2024/wordml/sdtformatlock" xmlns:w16se="http://schemas.microsoft.com/office/word/2015/wordml/symex" xmlns:wpg="http://schemas.microsoft.com/office/word/2010/wordprocessingGroup" xmlns:wpi="http://schemas.microsoft.com/office/word/2010/wordprocessingInk" xmlns:wne="http://schemas.microsoft.com/office/word/2006/wordml" xmlns:wps="http://schemas.microsoft.com/office/word/2010/wordprocessingShape" mc:Ignorable="w14 w15 w16se w16cid w16 w16cex w16sdtdh w16sdtfl w16du wp14">
+<w:numbering xmlns:wpc="http://schemas.microsoft.com/office/word/2010/wordprocessingCanvas" xmlns:cx="http://schemas.microsoft.com/office/drawing/2014/chartex" xmlns:cx1="http://schemas.microsoft.com/office/drawing/2015/9/8/chartex" xmlns:cx2="http://schemas.microsoft.com/office/drawing/2015/10/21/chartex" xmlns:cx3="http://schemas.microsoft.com/office/drawing/2016/5/9/chartex" xmlns:cx4="http://schemas.microsoft.com/office/drawing/2016/5/10/chartex" xmlns:cx5="http://schemas.microsoft.com/office/drawing/2016/5/11/chartex" xmlns:cx6="http://schemas.microsoft.com/office/drawing/2016/5/12/chartex" xmlns:cx7="http://schemas.microsoft.com/office/drawing/2016/5/13/chartex" xmlns:cx8="http://schemas.microsoft.com/office/drawing/2016/5/14/chartex" xmlns:mc="http://schemas.openxmlformats.org/markup-compatibility/2006" xmlns:aink="http://schemas.microsoft.com/office/drawing/2016/ink" xmlns:am3d="http://schemas.microsoft.com/office/drawing/2017/model3d" xmlns:o="urn:schemas-microsoft-com:office:office" xmlns:oel="http://schemas.microsoft.com/office/2019/extlst" xmlns:r="http://schemas.openxmlformats.org/officeDocument/2006/relationships" xmlns:m="http://schemas.openxmlformats.org/officeDocument/2006/math" xmlns:v="urn:schemas-microsoft-com:vml" xmlns:wp14="http://schemas.microsoft.com/office/word/2010/wordprocessingDrawing" xmlns:wp="http://schemas.openxmlformats.org/drawingml/2006/wordprocessingDrawing" xmlns:w10="urn:schemas-microsoft-com:office:word" xmlns:w="http://schemas.openxmlformats.org/wordprocessingml/2006/main" xmlns:w14="http://schemas.microsoft.com/office/word/2010/wordml" xmlns:w15="http://schemas.microsoft.com/office/word/2012/wordml" xmlns:w16cei="http://schemas.microsoft.com/office/word/2026/wordml/cei" xmlns:w16cex="http://schemas.microsoft.com/office/word/2018/wordml/cex" xmlns:w16cid="http://schemas.microsoft.com/office/word/2016/wordml/cid" xmlns:w16="http://schemas.microsoft.com/office/word/2018/wordml" xmlns:w16du="http://schemas.microsoft.com/office/word/2023/wordml/word16du" xmlns:w16sdtdh="http://schemas.microsoft.com/office/word/2020/wordml/sdtdatahash" xmlns:w16sdtfl="http://schemas.microsoft.com/office/word/2024/wordml/sdtformatlock" xmlns:w16se="http://schemas.microsoft.com/office/word/2015/wordml/symex" xmlns:wpg="http://schemas.microsoft.com/office/word/2010/wordprocessingGroup" xmlns:wpi="http://schemas.microsoft.com/office/word/2010/wordprocessingInk" xmlns:wne="http://schemas.microsoft.com/office/word/2006/wordml" xmlns:wps="http://schemas.microsoft.com/office/word/2010/wordprocessingShape" mc:Ignorable="w14 w15 w16se w16cid w16 w16cex w16sdtdh w16sdtfl w16du wp14">
   <w:abstractNum w:abstractNumId="0" w15:restartNumberingAfterBreak="0">
     <w:nsid w:val="2CB0122E"/>
     <w:multiLevelType w:val="multilevel"/>
@@ -2077,6 +3655,7 @@
   <w:style w:type="character" w:default="1" w:styleId="DefaultParagraphFont">
     <w:name w:val="Default Paragraph Font"/>
     <w:uiPriority w:val="1"/>
+    <w:semiHidden/>
     <w:unhideWhenUsed/>
   </w:style>
   <w:style w:type="table" w:default="1" w:styleId="TableNormal">

</xml_diff>

<commit_message>
Connect live dashboard data and occupancy views
</commit_message>
<xml_diff>
--- a/User Guid.docx
+++ b/User Guid.docx
@@ -2616,7 +2616,29 @@
     </w:tbl>
     <w:p/>
     <w:p/>
-    <w:p/>
+    <w:p>
+      <w:r>
+        <w:t xml:space="preserve">Production Login – Link : </w:t>
+      </w:r>
+      <w:hyperlink r:id="rId6" w:history="1">
+        <w:r>
+          <w:rPr>
+            <w:rStyle w:val="Hyperlink"/>
+          </w:rPr>
+          <w:t>https://rafiqi-central-dashboard.vercel.app/</w:t>
+        </w:r>
+      </w:hyperlink>
+    </w:p>
+    <w:p>
+      <w:r>
+        <w:t>  Email: rafiqi.control@nia.one</w:t>
+      </w:r>
+    </w:p>
+    <w:p>
+      <w:r>
+        <w:t>  Password: Nia@1234</w:t>
+      </w:r>
+    </w:p>
     <w:sectPr>
       <w:pgSz w:w="11906" w:h="16838"/>
       <w:pgMar w:top="1440" w:right="1440" w:bottom="1440" w:left="1440" w:header="708" w:footer="708" w:gutter="0"/>
@@ -3655,7 +3677,6 @@
   <w:style w:type="character" w:default="1" w:styleId="DefaultParagraphFont">
     <w:name w:val="Default Paragraph Font"/>
     <w:uiPriority w:val="1"/>
-    <w:semiHidden/>
     <w:unhideWhenUsed/>
   </w:style>
   <w:style w:type="table" w:default="1" w:styleId="TableNormal">

</xml_diff>